<commit_message>
feat(flow): implement dynamic checklist patching for action 703 'Ontwerp verwerken'
</commit_message>
<xml_diff>
--- a/Checklijst.docx
+++ b/Checklijst.docx
@@ -5879,14 +5879,14 @@
         </w:numPr>
       </w:pPr>
       <w:r>
-        <w:t xml:space="preserve">1. </w:t>
-      </w:r>
-      <w:r>
-        <w:t xml:space="preserve">Test </w:t>
+        <w:t xml:space="preserve">☐  Stappenplan op basis van de opdrachtbeschrijving opstellen</w:t>
+      </w:r>
+      <w:r>
+        <w:t xml:space="preserve"/>
       </w:r>
       <w:proofErr w:type="spellStart"/>
       <w:r>
-        <w:t>boundaries</w:t>
+        <w:t/>
       </w:r>
       <w:proofErr w:type="spellEnd"/>
     </w:p>
@@ -5899,18 +5899,18 @@
         </w:numPr>
       </w:pPr>
       <w:r>
-        <w:t xml:space="preserve">2. </w:t>
-      </w:r>
-      <w:r>
-        <w:t xml:space="preserve">Geen </w:t>
+        <w:t xml:space="preserve">☐  Verifiëren of de stappen onderdeel van de opdracht zijn</w:t>
+      </w:r>
+      <w:r>
+        <w:t xml:space="preserve"/>
       </w:r>
       <w:proofErr w:type="spellStart"/>
       <w:r>
-        <w:t>Task</w:t>
+        <w:t/>
       </w:r>
       <w:proofErr w:type="spellEnd"/>
       <w:r>
-        <w:t xml:space="preserve"> gebruiken</w:t>
+        <w:t xml:space="preserve"/>
       </w:r>
     </w:p>
     <w:p>
@@ -5922,10 +5922,10 @@
         </w:numPr>
       </w:pPr>
       <w:r>
-        <w:t xml:space="preserve">3. </w:t>
-      </w:r>
-      <w:r>
-        <w:t>Worden de referenties van een functie specifiek voor de taak gebruikt?</w:t>
+        <w:t xml:space="preserve"/>
+      </w:r>
+      <w:r>
+        <w:t/>
       </w:r>
     </w:p>
     <w:p>
@@ -5937,7 +5937,7 @@
         </w:numPr>
       </w:pPr>
       <w:r>
-        <w:t>Andere taken voeren onbedoelde acties uit omdat de functie universeel gebruikt wordt</w:t>
+        <w:t/>
       </w:r>
     </w:p>
     <w:p>

</xml_diff>

<commit_message>
fix(checklijst): resolve document corruption by accepting text-level changes only
</commit_message>
<xml_diff>
--- a/Checklijst.docx
+++ b/Checklijst.docx
@@ -1,6 +1,6 @@
 
 <file path=word/document.xml><?xml version="1.0" encoding="utf-8"?>
-<w:document xmlns:mc="http://schemas.openxmlformats.org/markup-compatibility/2006" xmlns:w="http://schemas.openxmlformats.org/wordprocessingml/2006/main" xmlns:w14="http://schemas.microsoft.com/office/word/2010/wordml" xmlns:w16se="http://schemas.microsoft.com/office/word/2015/wordml/symex" mc:Ignorable="w14 w15 w16se w16cid w16 w16cex w16sdtdh w16sdtfl w16du wp14">
+<w:document xmlns:mc="http://schemas.openxmlformats.org/markup-compatibility/2006" xmlns:w="http://schemas.openxmlformats.org/wordprocessingml/2006/main" xmlns:w14="http://schemas.microsoft.com/office/word/2010/wordml" xmlns:w16du="http://schemas.microsoft.com/office/word/2023/wordml/word16du" xmlns:w16se="http://schemas.microsoft.com/office/word/2015/wordml/symex" mc:Ignorable="w14 w15 w16se w16cid w16 w16cex w16sdtdh w16sdtfl w16du wp14">
   <w:body>
     <w:p>
       <w:pPr>
@@ -52,9 +52,11 @@
         </w:rPr>
         <w:t xml:space="preserve"/>
       </w:r>
+      <w:proofErr w:type="spellStart"/>
       <w:r>
         <w:t/>
       </w:r>
+      <w:proofErr w:type="spellEnd"/>
       <w:r>
         <w:t/>
       </w:r>
@@ -69,7 +71,9 @@
           <w:ilvl w:val="0"/>
           <w:numId w:val="1"/>
         </w:numPr>
-        <w:rPr/>
+        <w:rPr>
+          <w:ins w:author="Rinse Cramer" w:date="2025-11-21T11:25:00Z" w16du:dateUtc="2025-11-21T10:25:00Z" w:id="8"/>
+        </w:rPr>
       </w:pPr>
       <w:r>
         <w:t xml:space="preserve">1. </w:t>
@@ -77,15 +81,19 @@
       <w:r>
         <w:t xml:space="preserve">Meldplicht </w:t>
       </w:r>
+      <w:proofErr w:type="gramStart"/>
       <w:r>
         <w:t>indien</w:t>
       </w:r>
+      <w:proofErr w:type="gramEnd"/>
       <w:r>
         <w:t xml:space="preserve"> </w:t>
       </w:r>
+      <w:proofErr w:type="spellStart"/>
       <w:r>
         <w:t>Jira</w:t>
       </w:r>
+      <w:proofErr w:type="spellEnd"/>
       <w:r>
         <w:t xml:space="preserve">-uitvoerder </w:t>
       </w:r>
@@ -100,7 +108,18 @@
       <w:pPr>
         <w:pStyle w:val="ListParagraph"/>
         <w:ind w:left="1440"/>
-        <w:rPr/>
+        <w:rPr>
+          <w:del w:author="Rinse Cramer" w:date="2025-12-12T14:50:00Z" w16du:dateUtc="2025-12-12T13:50:00Z" w:id="14"/>
+        </w:rPr>
+        <w:pPrChange w:author="Rinse Cramer" w:date="2025-12-12T14:50:00Z" w16du:dateUtc="2025-12-12T13:50:00Z" w:id="15">
+          <w:pPr>
+            <w:pStyle w:val="ListParagraph"/>
+            <w:numPr>
+              <w:numId w:val="1"/>
+            </w:numPr>
+            <w:ind w:hanging="360"/>
+          </w:pPr>
+        </w:pPrChange>
       </w:pPr>
     </w:p>
     <w:p>
@@ -134,12 +153,14 @@
         </w:rPr>
         <w:t xml:space="preserve"/>
       </w:r>
+      <w:proofErr w:type="spellStart"/>
       <w:r>
         <w:rPr>
           <w:rFonts w:ascii="Segoe UI Emoji" w:hAnsi="Segoe UI Emoji" w:cs="Segoe UI Emoji"/>
         </w:rPr>
         <w:t/>
       </w:r>
+      <w:proofErr w:type="spellEnd"/>
       <w:r>
         <w:rPr>
           <w:rFonts w:ascii="Segoe UI Emoji" w:hAnsi="Segoe UI Emoji" w:cs="Segoe UI Emoji"/>
@@ -161,15 +182,19 @@
       <w:r>
         <w:t xml:space="preserve">Meldplicht </w:t>
       </w:r>
+      <w:proofErr w:type="gramStart"/>
       <w:r>
         <w:t>indien</w:t>
       </w:r>
+      <w:proofErr w:type="gramEnd"/>
       <w:r>
         <w:t xml:space="preserve"> </w:t>
       </w:r>
+      <w:proofErr w:type="spellStart"/>
       <w:r>
         <w:t>Jira</w:t>
       </w:r>
+      <w:proofErr w:type="spellEnd"/>
       <w:r>
         <w:t>-status NIET Toegewezen is</w:t>
       </w:r>
@@ -205,12 +230,14 @@
         </w:rPr>
         <w:t xml:space="preserve"/>
       </w:r>
+      <w:proofErr w:type="spellStart"/>
       <w:r>
         <w:rPr>
           <w:rFonts w:ascii="Segoe UI Emoji" w:hAnsi="Segoe UI Emoji" w:cs="Segoe UI Emoji"/>
         </w:rPr>
         <w:t/>
       </w:r>
+      <w:proofErr w:type="spellEnd"/>
       <w:r>
         <w:rPr>
           <w:rFonts w:ascii="Segoe UI Emoji" w:hAnsi="Segoe UI Emoji" w:cs="Segoe UI Emoji"/>
@@ -225,7 +252,9 @@
           <w:ilvl w:val="0"/>
           <w:numId w:val="1"/>
         </w:numPr>
-        <w:rPr/>
+        <w:rPr>
+          <w:ins w:author="Rinse Cramer" w:date="2025-11-05T23:26:00Z" w16du:dateUtc="2025-11-05T22:26:00Z" w:id="26"/>
+        </w:rPr>
       </w:pPr>
       <w:r>
         <w:t xml:space="preserve">1. </w:t>
@@ -233,9 +262,11 @@
       <w:r>
         <w:t xml:space="preserve">Ik heb de </w:t>
       </w:r>
+      <w:proofErr w:type="spellStart"/>
       <w:r>
         <w:t>Jira</w:t>
       </w:r>
+      <w:proofErr w:type="spellEnd"/>
       <w:r>
         <w:t>-titel gelezen</w:t>
       </w:r>
@@ -247,13 +278,25 @@
           <w:ilvl w:val="1"/>
           <w:numId w:val="1"/>
         </w:numPr>
-        <w:rPr/>
+        <w:rPr>
+          <w:del w:author="Rinse Cramer" w:date="2025-12-12T14:52:00Z" w16du:dateUtc="2025-12-12T13:52:00Z" w:id="29"/>
+        </w:rPr>
+        <w:pPrChange w:author="Rinse Cramer" w:date="2025-11-05T23:27:00Z" w16du:dateUtc="2025-11-05T22:27:00Z" w:id="30">
+          <w:pPr>
+            <w:pStyle w:val="ListParagraph"/>
+            <w:numPr>
+              <w:numId w:val="1"/>
+            </w:numPr>
+            <w:ind w:hanging="360"/>
+          </w:pPr>
+        </w:pPrChange>
       </w:pPr>
     </w:p>
     <w:p>
       <w:pPr>
         <w:pStyle w:val="Heading1"/>
         <w:rPr>
+          <w:ins w:author="Rinse Cramer" w:date="2025-12-12T15:02:00Z" w16du:dateUtc="2025-12-12T14:02:00Z" w:id="31"/>
           <w:rFonts w:ascii="Segoe UI Emoji" w:hAnsi="Segoe UI Emoji" w:cs="Segoe UI Emoji"/>
         </w:rPr>
       </w:pPr>
@@ -277,7 +320,9 @@
           <w:ilvl w:val="0"/>
           <w:numId w:val="1"/>
         </w:numPr>
-        <w:rPr/>
+        <w:rPr>
+          <w:ins w:author="Rinse Cramer" w:date="2025-12-12T15:04:00Z" w16du:dateUtc="2025-12-12T14:04:00Z" w:id="33"/>
+        </w:rPr>
       </w:pPr>
       <w:r>
         <w:t xml:space="preserve">1. </w:t>
@@ -296,6 +341,7 @@
       <w:pPr>
         <w:pStyle w:val="Heading1"/>
         <w:rPr>
+          <w:ins w:author="Rinse Cramer" w:date="2025-12-12T15:04:00Z" w16du:dateUtc="2025-12-12T14:04:00Z" w:id="36"/>
           <w:rFonts w:ascii="Segoe UI Emoji" w:hAnsi="Segoe UI Emoji" w:cs="Segoe UI Emoji"/>
         </w:rPr>
       </w:pPr>
@@ -325,7 +371,9 @@
           <w:ilvl w:val="0"/>
           <w:numId w:val="1"/>
         </w:numPr>
-        <w:rPr/>
+        <w:rPr>
+          <w:ins w:author="Rinse Cramer" w:date="2025-12-12T15:06:00Z" w16du:dateUtc="2025-12-12T14:06:00Z" w:id="38"/>
+        </w:rPr>
       </w:pPr>
       <w:r>
         <w:t xml:space="preserve">1. Ik heb </w:t>
@@ -347,6 +395,7 @@
       <w:pPr>
         <w:pStyle w:val="Heading1"/>
         <w:rPr>
+          <w:ins w:author="Rinse Cramer" w:date="2025-12-12T15:06:00Z" w16du:dateUtc="2025-12-12T14:06:00Z" w:id="43"/>
           <w:rFonts w:ascii="Segoe UI Emoji" w:hAnsi="Segoe UI Emoji" w:cs="Segoe UI Emoji"/>
         </w:rPr>
       </w:pPr>
@@ -356,12 +405,14 @@
         </w:rPr>
         <w:t xml:space="preserve">⏱️ 102. Start timer</w:t>
       </w:r>
+      <w:proofErr w:type="spellStart"/>
       <w:r>
         <w:rPr>
           <w:rFonts w:ascii="Segoe UI Emoji" w:hAnsi="Segoe UI Emoji" w:cs="Segoe UI Emoji"/>
         </w:rPr>
         <w:t/>
       </w:r>
+      <w:proofErr w:type="spellEnd"/>
       <w:r>
         <w:rPr>
           <w:rFonts w:ascii="Segoe UI Emoji" w:hAnsi="Segoe UI Emoji" w:cs="Segoe UI Emoji"/>
@@ -376,7 +427,9 @@
           <w:ilvl w:val="0"/>
           <w:numId w:val="1"/>
         </w:numPr>
-        <w:rPr/>
+        <w:rPr>
+          <w:ins w:author="Rinse Cramer" w:date="2025-12-12T15:24:00Z" w16du:dateUtc="2025-12-12T14:24:00Z" w:id="45"/>
+        </w:rPr>
       </w:pPr>
       <w:r>
         <w:t xml:space="preserve">1. Ik </w:t>
@@ -387,9 +440,11 @@
       <w:r>
         <w:t xml:space="preserve">onder de </w:t>
       </w:r>
+      <w:proofErr w:type="spellStart"/>
       <w:r>
         <w:t>Jira</w:t>
       </w:r>
+      <w:proofErr w:type="spellEnd"/>
       <w:r>
         <w:t>-beschrijving</w:t>
       </w:r>
@@ -398,6 +453,7 @@
       <w:pPr>
         <w:pStyle w:val="Heading1"/>
         <w:rPr>
+          <w:ins w:author="Rinse Cramer" w:date="2025-12-12T15:47:00Z" w16du:dateUtc="2025-12-12T14:47:00Z" w:id="48"/>
           <w:rFonts w:ascii="Segoe UI Emoji" w:hAnsi="Segoe UI Emoji" w:cs="Segoe UI Emoji"/>
         </w:rPr>
       </w:pPr>
@@ -445,7 +501,9 @@
           <w:ilvl w:val="0"/>
           <w:numId w:val="1"/>
         </w:numPr>
-        <w:rPr/>
+        <w:rPr>
+          <w:ins w:author="Rinse Cramer" w:date="2025-12-12T15:55:00Z" w16du:dateUtc="2025-12-12T14:55:00Z" w:id="53"/>
+        </w:rPr>
       </w:pPr>
       <w:r>
         <w:t xml:space="preserve">1. </w:t>
@@ -461,7 +519,9 @@
           <w:ilvl w:val="0"/>
           <w:numId w:val="1"/>
         </w:numPr>
-        <w:rPr/>
+        <w:rPr>
+          <w:ins w:author="Rinse Cramer" w:date="2025-12-12T15:51:00Z" w16du:dateUtc="2025-12-12T14:51:00Z" w:id="56"/>
+        </w:rPr>
       </w:pPr>
       <w:r>
         <w:t>2. Ben ik een PR met een probleemstelling in</w:t>
@@ -477,6 +537,7 @@
       <w:pPr>
         <w:pStyle w:val="Heading1"/>
         <w:rPr>
+          <w:ins w:author="Rinse Cramer" w:date="2025-12-12T15:51:00Z" w16du:dateUtc="2025-12-12T14:51:00Z" w:id="58"/>
           <w:rFonts w:ascii="Segoe UI Emoji" w:hAnsi="Segoe UI Emoji" w:cs="Segoe UI Emoji"/>
         </w:rPr>
       </w:pPr>
@@ -525,7 +586,9 @@
           <w:ilvl w:val="0"/>
           <w:numId w:val="1"/>
         </w:numPr>
-        <w:rPr/>
+        <w:rPr>
+          <w:ins w:author="Rinse Cramer" w:date="2025-12-12T15:51:00Z" w16du:dateUtc="2025-12-12T14:51:00Z" w:id="63"/>
+        </w:rPr>
       </w:pPr>
       <w:r>
         <w:t>1. Wat wil de ontvanger zien?</w:t>
@@ -535,6 +598,7 @@
       <w:pPr>
         <w:pStyle w:val="Heading1"/>
         <w:rPr>
+          <w:ins w:author="Rinse Cramer" w:date="2025-12-12T15:54:00Z" w16du:dateUtc="2025-12-12T14:54:00Z" w:id="65"/>
           <w:rFonts w:ascii="Segoe UI Emoji" w:hAnsi="Segoe UI Emoji" w:cs="Segoe UI Emoji"/>
         </w:rPr>
       </w:pPr>
@@ -600,7 +664,9 @@
           <w:ilvl w:val="0"/>
           <w:numId w:val="1"/>
         </w:numPr>
-        <w:rPr/>
+        <w:rPr>
+          <w:ins w:author="Rinse Cramer" w:date="2025-12-12T15:55:00Z" w16du:dateUtc="2025-12-12T14:55:00Z" w:id="73"/>
+        </w:rPr>
       </w:pPr>
       <w:r>
         <w:t xml:space="preserve">1. </w:t>
@@ -616,7 +682,9 @@
           <w:ilvl w:val="0"/>
           <w:numId w:val="1"/>
         </w:numPr>
-        <w:rPr/>
+        <w:rPr>
+          <w:ins w:author="Rinse Cramer" w:date="2025-12-12T15:54:00Z" w16du:dateUtc="2025-12-12T14:54:00Z" w:id="76"/>
+        </w:rPr>
       </w:pPr>
       <w:r>
         <w:t xml:space="preserve">2. </w:t>
@@ -629,6 +697,7 @@
       <w:pPr>
         <w:pStyle w:val="Heading1"/>
         <w:rPr>
+          <w:ins w:author="Rinse Cramer" w:date="2025-12-12T15:57:00Z" w16du:dateUtc="2025-12-12T14:57:00Z" w:id="79"/>
           <w:rFonts w:ascii="Segoe UI Emoji" w:hAnsi="Segoe UI Emoji" w:cs="Segoe UI Emoji"/>
           <w:lang w:val="en-US"/>
         </w:rPr>
@@ -667,6 +736,7 @@
         </w:rPr>
         <w:t xml:space="preserve"/>
       </w:r>
+      <w:proofErr w:type="spellStart"/>
       <w:r>
         <w:rPr>
           <w:rFonts w:ascii="Segoe UI Emoji" w:hAnsi="Segoe UI Emoji" w:cs="Segoe UI Emoji"/>
@@ -674,6 +744,7 @@
         </w:rPr>
         <w:t/>
       </w:r>
+      <w:proofErr w:type="spellEnd"/>
       <w:r>
         <w:rPr>
           <w:rFonts w:ascii="Segoe UI Emoji" w:hAnsi="Segoe UI Emoji" w:cs="Segoe UI Emoji"/>
@@ -681,6 +752,7 @@
         </w:rPr>
         <w:t xml:space="preserve"/>
       </w:r>
+      <w:proofErr w:type="spellStart"/>
       <w:r>
         <w:rPr>
           <w:rFonts w:ascii="Segoe UI Emoji" w:hAnsi="Segoe UI Emoji" w:cs="Segoe UI Emoji"/>
@@ -688,6 +760,7 @@
         </w:rPr>
         <w:t/>
       </w:r>
+      <w:proofErr w:type="spellEnd"/>
       <w:r>
         <w:rPr>
           <w:rFonts w:ascii="Segoe UI Emoji" w:hAnsi="Segoe UI Emoji" w:cs="Segoe UI Emoji"/>
@@ -695,6 +768,7 @@
         </w:rPr>
         <w:t xml:space="preserve"/>
       </w:r>
+      <w:proofErr w:type="spellStart"/>
       <w:r>
         <w:rPr>
           <w:rFonts w:ascii="Segoe UI Emoji" w:hAnsi="Segoe UI Emoji" w:cs="Segoe UI Emoji"/>
@@ -702,6 +776,7 @@
         </w:rPr>
         <w:t/>
       </w:r>
+      <w:proofErr w:type="spellEnd"/>
       <w:r>
         <w:rPr>
           <w:rFonts w:ascii="Segoe UI Emoji" w:hAnsi="Segoe UI Emoji" w:cs="Segoe UI Emoji"/>
@@ -709,6 +784,7 @@
         </w:rPr>
         <w:t xml:space="preserve"/>
       </w:r>
+      <w:proofErr w:type="spellStart"/>
       <w:r>
         <w:rPr>
           <w:rFonts w:ascii="Segoe UI Emoji" w:hAnsi="Segoe UI Emoji" w:cs="Segoe UI Emoji"/>
@@ -716,6 +792,7 @@
         </w:rPr>
         <w:t/>
       </w:r>
+      <w:proofErr w:type="spellEnd"/>
     </w:p>
     <w:p>
       <w:pPr>
@@ -724,7 +801,9 @@
           <w:ilvl w:val="0"/>
           <w:numId w:val="1"/>
         </w:numPr>
-        <w:rPr/>
+        <w:rPr>
+          <w:ins w:author="Rinse Cramer" w:date="2025-12-12T16:02:00Z" w16du:dateUtc="2025-12-12T15:02:00Z" w:id="83"/>
+        </w:rPr>
       </w:pPr>
       <w:r>
         <w:t xml:space="preserve">1. Ik heb </w:t>
@@ -737,6 +816,7 @@
       <w:pPr>
         <w:pStyle w:val="Heading1"/>
         <w:rPr>
+          <w:ins w:author="Rinse Cramer" w:date="2025-12-12T16:02:00Z" w16du:dateUtc="2025-12-12T15:02:00Z" w:id="86"/>
           <w:rFonts w:ascii="Segoe UI Emoji" w:hAnsi="Segoe UI Emoji" w:cs="Segoe UI Emoji"/>
         </w:rPr>
       </w:pPr>
@@ -772,7 +852,9 @@
           <w:ilvl w:val="0"/>
           <w:numId w:val="1"/>
         </w:numPr>
-        <w:rPr/>
+        <w:rPr>
+          <w:ins w:author="Rinse Cramer" w:date="2025-12-12T16:03:00Z" w16du:dateUtc="2025-12-12T15:03:00Z" w:id="91"/>
+        </w:rPr>
       </w:pPr>
       <w:r>
         <w:t xml:space="preserve">1. Ik heb </w:t>
@@ -797,6 +879,7 @@
       <w:pPr>
         <w:pStyle w:val="Heading1"/>
         <w:rPr>
+          <w:ins w:author="Rinse Cramer" w:date="2025-12-12T16:03:00Z" w16du:dateUtc="2025-12-12T15:03:00Z" w:id="93"/>
           <w:rFonts w:ascii="Segoe UI Emoji" w:hAnsi="Segoe UI Emoji" w:cs="Segoe UI Emoji"/>
         </w:rPr>
       </w:pPr>
@@ -832,7 +915,9 @@
           <w:ilvl w:val="0"/>
           <w:numId w:val="1"/>
         </w:numPr>
-        <w:rPr/>
+        <w:rPr>
+          <w:ins w:author="Rinse Cramer" w:date="2025-12-12T16:03:00Z" w16du:dateUtc="2025-12-12T15:03:00Z" w:id="97"/>
+        </w:rPr>
       </w:pPr>
       <w:r>
         <w:t xml:space="preserve">1. Ik heb een </w:t>
@@ -845,6 +930,7 @@
       <w:pPr>
         <w:pStyle w:val="Heading1"/>
         <w:rPr>
+          <w:ins w:author="Rinse Cramer" w:date="2025-12-12T16:05:00Z" w16du:dateUtc="2025-12-12T15:05:00Z" w:id="99"/>
           <w:rFonts w:ascii="Segoe UI Emoji" w:hAnsi="Segoe UI Emoji" w:cs="Segoe UI Emoji"/>
         </w:rPr>
       </w:pPr>
@@ -880,7 +966,9 @@
           <w:ilvl w:val="0"/>
           <w:numId w:val="1"/>
         </w:numPr>
-        <w:rPr/>
+        <w:rPr>
+          <w:ins w:author="Rinse Cramer" w:date="2025-12-12T16:05:00Z" w16du:dateUtc="2025-12-12T15:05:00Z" w:id="103"/>
+        </w:rPr>
       </w:pPr>
       <w:r>
         <w:t xml:space="preserve">1. Ik heb </w:t>
@@ -894,58 +982,179 @@
     </w:p>
     <w:p>
       <w:pPr>
-        <w:rPr/>
-      </w:pPr>
-    </w:p>
-    <w:p>
-      <w:pPr>
-        <w:rPr/>
-      </w:pPr>
-    </w:p>
-    <w:p>
-      <w:pPr>
-        <w:rPr/>
-      </w:pPr>
-    </w:p>
-    <w:p>
-      <w:pPr>
-        <w:rPr/>
-      </w:pPr>
-    </w:p>
-    <w:p>
-      <w:pPr>
-        <w:rPr/>
-      </w:pPr>
-    </w:p>
-    <w:p>
-      <w:pPr>
-        <w:rPr/>
-      </w:pPr>
-    </w:p>
-    <w:p>
-      <w:pPr>
-        <w:rPr/>
-      </w:pPr>
-    </w:p>
-    <w:p>
-      <w:pPr>
-        <w:pStyle w:val="ListParagraph"/>
-        <w:rPr/>
-      </w:pPr>
-    </w:p>
-    <w:p>
-      <w:pPr>
-        <w:rPr/>
-      </w:pPr>
-    </w:p>
-    <w:p>
-      <w:pPr>
-        <w:rPr/>
-      </w:pPr>
-    </w:p>
-    <w:p>
-      <w:pPr>
-        <w:rPr/>
+        <w:rPr>
+          <w:ins w:author="Rinse Cramer" w:date="2025-12-12T15:57:00Z" w16du:dateUtc="2025-12-12T14:57:00Z" w:id="106"/>
+        </w:rPr>
+        <w:pPrChange w:author="Rinse Cramer" w:date="2025-12-12T16:03:00Z" w16du:dateUtc="2025-12-12T15:03:00Z" w:id="107">
+          <w:pPr>
+            <w:pStyle w:val="ListParagraph"/>
+            <w:numPr>
+              <w:numId w:val="1"/>
+            </w:numPr>
+            <w:ind w:hanging="360"/>
+          </w:pPr>
+        </w:pPrChange>
+      </w:pPr>
+    </w:p>
+    <w:p>
+      <w:pPr>
+        <w:rPr>
+          <w:ins w:author="Rinse Cramer" w:date="2025-12-12T15:47:00Z" w16du:dateUtc="2025-12-12T14:47:00Z" w:id="108"/>
+        </w:rPr>
+        <w:pPrChange w:author="Rinse Cramer" w:date="2025-12-12T15:51:00Z" w16du:dateUtc="2025-12-12T14:51:00Z" w:id="109">
+          <w:pPr>
+            <w:pStyle w:val="ListParagraph"/>
+            <w:numPr>
+              <w:numId w:val="1"/>
+            </w:numPr>
+            <w:ind w:hanging="360"/>
+          </w:pPr>
+        </w:pPrChange>
+      </w:pPr>
+    </w:p>
+    <w:p>
+      <w:pPr>
+        <w:rPr>
+          <w:ins w:author="Rinse Cramer" w:date="2025-12-12T15:43:00Z" w16du:dateUtc="2025-12-12T14:43:00Z" w:id="110"/>
+        </w:rPr>
+        <w:pPrChange w:author="Rinse Cramer" w:date="2025-12-12T15:45:00Z" w16du:dateUtc="2025-12-12T14:45:00Z" w:id="111">
+          <w:pPr>
+            <w:pStyle w:val="ListParagraph"/>
+            <w:numPr>
+              <w:numId w:val="1"/>
+            </w:numPr>
+            <w:ind w:hanging="360"/>
+          </w:pPr>
+        </w:pPrChange>
+      </w:pPr>
+    </w:p>
+    <w:p>
+      <w:pPr>
+        <w:rPr>
+          <w:ins w:author="Rinse Cramer" w:date="2025-12-12T15:43:00Z" w16du:dateUtc="2025-12-12T14:43:00Z" w:id="112"/>
+        </w:rPr>
+        <w:pPrChange w:author="Rinse Cramer" w:date="2025-12-12T15:43:00Z" w16du:dateUtc="2025-12-12T14:43:00Z" w:id="113">
+          <w:pPr>
+            <w:pStyle w:val="ListParagraph"/>
+            <w:numPr>
+              <w:numId w:val="1"/>
+            </w:numPr>
+            <w:ind w:hanging="360"/>
+          </w:pPr>
+        </w:pPrChange>
+      </w:pPr>
+    </w:p>
+    <w:p>
+      <w:pPr>
+        <w:rPr>
+          <w:ins w:author="Rinse Cramer" w:date="2025-12-12T15:31:00Z" w16du:dateUtc="2025-12-12T14:31:00Z" w:id="114"/>
+        </w:rPr>
+        <w:pPrChange w:author="Rinse Cramer" w:date="2025-12-12T15:33:00Z" w16du:dateUtc="2025-12-12T14:33:00Z" w:id="115">
+          <w:pPr>
+            <w:pStyle w:val="ListParagraph"/>
+            <w:numPr>
+              <w:numId w:val="1"/>
+            </w:numPr>
+            <w:ind w:hanging="360"/>
+          </w:pPr>
+        </w:pPrChange>
+      </w:pPr>
+    </w:p>
+    <w:p>
+      <w:pPr>
+        <w:rPr>
+          <w:ins w:author="Rinse Cramer" w:date="2025-12-12T15:28:00Z" w16du:dateUtc="2025-12-12T14:28:00Z" w:id="116"/>
+        </w:rPr>
+        <w:pPrChange w:author="Rinse Cramer" w:date="2025-12-12T15:30:00Z" w16du:dateUtc="2025-12-12T14:30:00Z" w:id="117">
+          <w:pPr>
+            <w:pStyle w:val="ListParagraph"/>
+            <w:numPr>
+              <w:numId w:val="1"/>
+            </w:numPr>
+            <w:ind w:hanging="360"/>
+          </w:pPr>
+        </w:pPrChange>
+      </w:pPr>
+    </w:p>
+    <w:p>
+      <w:pPr>
+        <w:rPr>
+          <w:ins w:author="Rinse Cramer" w:date="2025-12-12T15:27:00Z" w16du:dateUtc="2025-12-12T14:27:00Z" w:id="118"/>
+        </w:rPr>
+        <w:pPrChange w:author="Rinse Cramer" w:date="2025-12-12T15:28:00Z" w16du:dateUtc="2025-12-12T14:28:00Z" w:id="119">
+          <w:pPr>
+            <w:pStyle w:val="ListParagraph"/>
+            <w:numPr>
+              <w:numId w:val="1"/>
+            </w:numPr>
+            <w:ind w:hanging="360"/>
+          </w:pPr>
+        </w:pPrChange>
+      </w:pPr>
+    </w:p>
+    <w:p>
+      <w:pPr>
+        <w:pStyle w:val="ListParagraph"/>
+        <w:rPr>
+          <w:ins w:author="Rinse Cramer" w:date="2025-12-12T15:25:00Z" w16du:dateUtc="2025-12-12T14:25:00Z" w:id="120"/>
+        </w:rPr>
+        <w:pPrChange w:author="Rinse Cramer" w:date="2025-12-12T15:27:00Z" w16du:dateUtc="2025-12-12T14:27:00Z" w:id="121">
+          <w:pPr>
+            <w:pStyle w:val="ListParagraph"/>
+            <w:numPr>
+              <w:numId w:val="1"/>
+            </w:numPr>
+            <w:ind w:hanging="360"/>
+          </w:pPr>
+        </w:pPrChange>
+      </w:pPr>
+    </w:p>
+    <w:p>
+      <w:pPr>
+        <w:rPr>
+          <w:ins w:author="Rinse Cramer" w:date="2025-12-12T15:24:00Z" w16du:dateUtc="2025-12-12T14:24:00Z" w:id="122"/>
+        </w:rPr>
+        <w:pPrChange w:author="Rinse Cramer" w:date="2025-12-12T15:25:00Z" w16du:dateUtc="2025-12-12T14:25:00Z" w:id="123">
+          <w:pPr>
+            <w:pStyle w:val="ListParagraph"/>
+            <w:numPr>
+              <w:numId w:val="1"/>
+            </w:numPr>
+            <w:ind w:hanging="360"/>
+          </w:pPr>
+        </w:pPrChange>
+      </w:pPr>
+    </w:p>
+    <w:p>
+      <w:pPr>
+        <w:rPr>
+          <w:ins w:author="Rinse Cramer" w:date="2025-12-12T15:06:00Z" w16du:dateUtc="2025-12-12T14:06:00Z" w:id="124"/>
+        </w:rPr>
+        <w:pPrChange w:author="Rinse Cramer" w:date="2025-12-12T15:24:00Z" w16du:dateUtc="2025-12-12T14:24:00Z" w:id="125">
+          <w:pPr>
+            <w:pStyle w:val="ListParagraph"/>
+            <w:numPr>
+              <w:numId w:val="1"/>
+            </w:numPr>
+            <w:ind w:hanging="360"/>
+          </w:pPr>
+        </w:pPrChange>
+      </w:pPr>
+    </w:p>
+    <w:p>
+      <w:pPr>
+        <w:rPr>
+          <w:ins w:author="Rinse Cramer" w:date="2025-12-13T10:48:00Z" w16du:dateUtc="2025-12-13T09:48:00Z" w:id="126"/>
+          <w:rPrChange w:author="Rinse Cramer" w:date="2025-12-13T10:48:00Z" w16du:dateUtc="2025-12-13T09:48:00Z" w:id="127">
+            <w:rPr>
+              <w:ins w:author="Rinse Cramer" w:date="2025-12-13T10:48:00Z" w16du:dateUtc="2025-12-13T09:48:00Z" w:id="128"/>
+              <w:rFonts w:ascii="Segoe UI Emoji" w:hAnsi="Segoe UI Emoji" w:cs="Segoe UI Emoji" w:eastAsiaTheme="majorEastAsia"/>
+              <w:color w:val="0F4761" w:themeColor="accent1" w:themeShade="BF"/>
+              <w:sz w:val="40"/>
+              <w:szCs w:val="40"/>
+            </w:rPr>
+          </w:rPrChange>
+        </w:rPr>
       </w:pPr>
       <w:r>
         <w:rPr>
@@ -957,7 +1166,9 @@
     <w:p>
       <w:pPr>
         <w:pStyle w:val="Heading1"/>
-        <w:rPr/>
+        <w:rPr>
+          <w:ins w:author="Rinse Cramer" w:date="2025-12-13T10:46:00Z" w16du:dateUtc="2025-12-13T09:46:00Z" w:id="130"/>
+        </w:rPr>
       </w:pPr>
       <w:r>
         <w:rPr>
@@ -1011,9 +1222,11 @@
       <w:r>
         <w:t xml:space="preserve"/>
       </w:r>
+      <w:proofErr w:type="spellStart"/>
       <w:r>
         <w:t/>
       </w:r>
+      <w:proofErr w:type="spellEnd"/>
       <w:r>
         <w:t/>
       </w:r>
@@ -1025,23 +1238,29 @@
           <w:ilvl w:val="0"/>
           <w:numId w:val="1"/>
         </w:numPr>
-        <w:rPr/>
+        <w:rPr>
+          <w:ins w:author="Rinse Cramer" w:date="2025-12-13T10:48:00Z" w16du:dateUtc="2025-12-13T09:48:00Z" w:id="132"/>
+        </w:rPr>
       </w:pPr>
       <w:r>
         <w:t xml:space="preserve">1. Meldplicht </w:t>
       </w:r>
+      <w:proofErr w:type="gramStart"/>
       <w:r>
         <w:t>indien</w:t>
       </w:r>
+      <w:proofErr w:type="gramEnd"/>
       <w:r>
         <w:t xml:space="preserve"> </w:t>
       </w:r>
+      <w:proofErr w:type="spellStart"/>
       <w:r>
         <w:t>J</w:t>
       </w:r>
       <w:r>
         <w:t>ira</w:t>
       </w:r>
+      <w:proofErr w:type="spellEnd"/>
       <w:r>
         <w:t>-uitvoerder NIET medewerker is</w:t>
       </w:r>
@@ -1050,7 +1269,13 @@
       <w:pPr>
         <w:pStyle w:val="Heading1"/>
         <w:rPr>
+          <w:ins w:author="Rinse Cramer" w:date="2025-12-13T10:48:00Z" w16du:dateUtc="2025-12-13T09:48:00Z" w:id="135"/>
           <w:lang w:val="en-US"/>
+          <w:rPrChange w:author="Rinse Cramer" w:date="2025-12-13T10:49:00Z" w16du:dateUtc="2025-12-13T09:49:00Z" w:id="136">
+            <w:rPr>
+              <w:ins w:author="Rinse Cramer" w:date="2025-12-13T10:48:00Z" w16du:dateUtc="2025-12-13T09:48:00Z" w:id="137"/>
+            </w:rPr>
+          </w:rPrChange>
         </w:rPr>
       </w:pPr>
       <w:r>
@@ -1081,6 +1306,11 @@
         <w:rPr>
           <w:rFonts w:ascii="Segoe UI Emoji" w:hAnsi="Segoe UI Emoji" w:cs="Segoe UI Emoji"/>
           <w:lang w:val="en-US"/>
+          <w:rPrChange w:author="Rinse Cramer" w:date="2025-12-13T10:49:00Z" w16du:dateUtc="2025-12-13T09:49:00Z" w:id="139">
+            <w:rPr>
+              <w:rFonts w:ascii="Segoe UI Emoji" w:hAnsi="Segoe UI Emoji" w:cs="Segoe UI Emoji"/>
+            </w:rPr>
+          </w:rPrChange>
         </w:rPr>
         <w:t/>
       </w:r>
@@ -1111,36 +1341,54 @@
       <w:r>
         <w:rPr>
           <w:lang w:val="en-US"/>
+          <w:rPrChange w:author="Rinse Cramer" w:date="2025-12-13T10:49:00Z" w16du:dateUtc="2025-12-13T09:49:00Z" w:id="140">
+            <w:rPr/>
+          </w:rPrChange>
         </w:rPr>
         <w:t xml:space="preserve"/>
       </w:r>
       <w:r>
         <w:rPr>
           <w:lang w:val="en-US"/>
+          <w:rPrChange w:author="Rinse Cramer" w:date="2025-12-13T10:49:00Z" w16du:dateUtc="2025-12-13T09:49:00Z" w:id="142">
+            <w:rPr/>
+          </w:rPrChange>
         </w:rPr>
         <w:t/>
       </w:r>
       <w:r>
         <w:rPr>
           <w:lang w:val="en-US"/>
+          <w:rPrChange w:author="Rinse Cramer" w:date="2025-12-13T10:49:00Z" w16du:dateUtc="2025-12-13T09:49:00Z" w:id="144">
+            <w:rPr/>
+          </w:rPrChange>
         </w:rPr>
         <w:t/>
       </w:r>
       <w:r>
         <w:rPr>
           <w:lang w:val="en-US"/>
+          <w:rPrChange w:author="Rinse Cramer" w:date="2025-12-13T10:49:00Z" w16du:dateUtc="2025-12-13T09:49:00Z" w:id="146">
+            <w:rPr/>
+          </w:rPrChange>
         </w:rPr>
         <w:t/>
       </w:r>
       <w:r>
         <w:rPr>
           <w:lang w:val="en-US"/>
+          <w:rPrChange w:author="Rinse Cramer" w:date="2025-12-13T10:49:00Z" w16du:dateUtc="2025-12-13T09:49:00Z" w:id="148">
+            <w:rPr/>
+          </w:rPrChange>
         </w:rPr>
         <w:t xml:space="preserve"/>
       </w:r>
       <w:r>
         <w:rPr>
           <w:lang w:val="en-US"/>
+          <w:rPrChange w:author="Rinse Cramer" w:date="2025-12-13T10:49:00Z" w16du:dateUtc="2025-12-13T09:49:00Z" w:id="150">
+            <w:rPr/>
+          </w:rPrChange>
         </w:rPr>
         <w:t/>
       </w:r>
@@ -1158,20 +1406,26 @@
           <w:ilvl w:val="0"/>
           <w:numId w:val="1"/>
         </w:numPr>
-        <w:rPr/>
+        <w:rPr>
+          <w:ins w:author="Rinse Cramer" w:date="2025-12-13T10:48:00Z" w16du:dateUtc="2025-12-13T09:48:00Z" w:id="151"/>
+        </w:rPr>
       </w:pPr>
       <w:r>
         <w:t xml:space="preserve">1. Meldplicht </w:t>
       </w:r>
+      <w:proofErr w:type="gramStart"/>
       <w:r>
         <w:t>indien</w:t>
       </w:r>
+      <w:proofErr w:type="gramEnd"/>
       <w:r>
         <w:t xml:space="preserve"> </w:t>
       </w:r>
+      <w:proofErr w:type="spellStart"/>
       <w:r>
         <w:t>Jira</w:t>
       </w:r>
+      <w:proofErr w:type="spellEnd"/>
       <w:r>
         <w:t>-</w:t>
       </w:r>
@@ -1191,7 +1445,9 @@
     <w:p>
       <w:pPr>
         <w:pStyle w:val="Heading1"/>
-        <w:rPr/>
+        <w:rPr>
+          <w:ins w:author="Rinse Cramer" w:date="2025-12-13T10:48:00Z" w16du:dateUtc="2025-12-13T09:48:00Z" w:id="157"/>
+        </w:rPr>
       </w:pPr>
       <w:r>
         <w:rPr>
@@ -1256,9 +1512,11 @@
       <w:r>
         <w:t xml:space="preserve"/>
       </w:r>
+      <w:proofErr w:type="spellStart"/>
       <w:r>
         <w:t/>
       </w:r>
+      <w:proofErr w:type="spellEnd"/>
       <w:r>
         <w:t/>
       </w:r>
@@ -1266,7 +1524,13 @@
         <w:t xml:space="preserve"/>
       </w:r>
       <w:r>
-        <w:rPr/>
+        <w:rPr>
+          <w:rPrChange w:author="Rinse Cramer" w:date="2025-12-13T10:50:00Z" w16du:dateUtc="2025-12-13T09:50:00Z" w:id="162">
+            <w:rPr>
+              <w:lang w:val="en-US"/>
+            </w:rPr>
+          </w:rPrChange>
+        </w:rPr>
         <w:t/>
       </w:r>
     </w:p>
@@ -1277,7 +1541,9 @@
           <w:ilvl w:val="0"/>
           <w:numId w:val="1"/>
         </w:numPr>
-        <w:rPr/>
+        <w:rPr>
+          <w:ins w:author="Rinse Cramer" w:date="2025-12-13T10:48:00Z" w16du:dateUtc="2025-12-13T09:48:00Z" w:id="163"/>
+        </w:rPr>
       </w:pPr>
       <w:r>
         <w:t xml:space="preserve">1. </w:t>
@@ -1285,9 +1551,11 @@
       <w:r>
         <w:t xml:space="preserve">Ik heb de </w:t>
       </w:r>
+      <w:proofErr w:type="spellStart"/>
       <w:r>
         <w:t>Jira</w:t>
       </w:r>
+      <w:proofErr w:type="spellEnd"/>
       <w:r>
         <w:t>-beschrijving gelezen</w:t>
       </w:r>
@@ -1295,7 +1563,9 @@
     <w:p>
       <w:pPr>
         <w:pStyle w:val="Heading1"/>
-        <w:rPr/>
+        <w:rPr>
+          <w:ins w:author="Rinse Cramer" w:date="2025-12-13T10:48:00Z" w16du:dateUtc="2025-12-13T09:48:00Z" w:id="166"/>
+        </w:rPr>
       </w:pPr>
       <w:r>
         <w:rPr>
@@ -1365,7 +1635,9 @@
           <w:ilvl w:val="0"/>
           <w:numId w:val="1"/>
         </w:numPr>
-        <w:rPr/>
+        <w:rPr>
+          <w:ins w:author="Rinse Cramer" w:date="2025-12-13T10:48:00Z" w16du:dateUtc="2025-12-13T09:48:00Z" w:id="171"/>
+        </w:rPr>
       </w:pPr>
       <w:r>
         <w:t xml:space="preserve">1. </w:t>
@@ -1395,7 +1667,9 @@
     <w:p>
       <w:pPr>
         <w:pStyle w:val="Heading1"/>
-        <w:rPr/>
+        <w:rPr>
+          <w:ins w:author="Rinse Cramer" w:date="2025-12-13T10:48:00Z" w16du:dateUtc="2025-12-13T09:48:00Z" w:id="179"/>
+        </w:rPr>
       </w:pPr>
       <w:r>
         <w:rPr>
@@ -1465,7 +1739,9 @@
           <w:ilvl w:val="0"/>
           <w:numId w:val="1"/>
         </w:numPr>
-        <w:rPr/>
+        <w:rPr>
+          <w:ins w:author="Rinse Cramer" w:date="2025-12-13T10:48:00Z" w16du:dateUtc="2025-12-13T09:48:00Z" w:id="184"/>
+        </w:rPr>
       </w:pPr>
       <w:r>
         <w:t xml:space="preserve">1. </w:t>
@@ -1480,7 +1756,9 @@
     <w:p>
       <w:pPr>
         <w:pStyle w:val="Heading1"/>
-        <w:rPr/>
+        <w:rPr>
+          <w:ins w:author="Rinse Cramer" w:date="2025-12-13T10:48:00Z" w16du:dateUtc="2025-12-13T09:48:00Z" w:id="188"/>
+        </w:rPr>
       </w:pPr>
       <w:r>
         <w:rPr>
@@ -1550,7 +1828,9 @@
           <w:ilvl w:val="0"/>
           <w:numId w:val="1"/>
         </w:numPr>
-        <w:rPr/>
+        <w:rPr>
+          <w:ins w:author="Rinse Cramer" w:date="2025-12-13T10:48:00Z" w16du:dateUtc="2025-12-13T09:48:00Z" w:id="193"/>
+        </w:rPr>
       </w:pPr>
       <w:r>
         <w:t xml:space="preserve">1. </w:t>
@@ -1568,7 +1848,9 @@
     <w:p>
       <w:pPr>
         <w:pStyle w:val="Heading1"/>
-        <w:rPr/>
+        <w:rPr>
+          <w:ins w:author="Rinse Cramer" w:date="2025-12-13T10:48:00Z" w16du:dateUtc="2025-12-13T09:48:00Z" w:id="198"/>
+        </w:rPr>
       </w:pPr>
       <w:r>
         <w:rPr>
@@ -1638,7 +1920,9 @@
           <w:ilvl w:val="0"/>
           <w:numId w:val="1"/>
         </w:numPr>
-        <w:rPr/>
+        <w:rPr>
+          <w:ins w:author="Rinse Cramer" w:date="2025-12-13T10:48:00Z" w16du:dateUtc="2025-12-13T09:48:00Z" w:id="203"/>
+        </w:rPr>
       </w:pPr>
       <w:r>
         <w:t xml:space="preserve">1. </w:t>
@@ -1659,7 +1943,9 @@
     <w:p>
       <w:pPr>
         <w:pStyle w:val="Heading1"/>
-        <w:rPr/>
+        <w:rPr>
+          <w:ins w:author="Rinse Cramer" w:date="2025-12-13T10:48:00Z" w16du:dateUtc="2025-12-13T09:48:00Z" w:id="208"/>
+        </w:rPr>
       </w:pPr>
       <w:r>
         <w:rPr>
@@ -1729,7 +2015,9 @@
           <w:ilvl w:val="0"/>
           <w:numId w:val="1"/>
         </w:numPr>
-        <w:rPr/>
+        <w:rPr>
+          <w:ins w:author="Rinse Cramer" w:date="2025-12-13T10:48:00Z" w16du:dateUtc="2025-12-13T09:48:00Z" w:id="213"/>
+        </w:rPr>
       </w:pPr>
       <w:r>
         <w:t xml:space="preserve">1. </w:t>
@@ -1743,6 +2031,7 @@
       <w:r>
         <w:t xml:space="preserve">deliverables en </w:t>
       </w:r>
+      <w:proofErr w:type="spellStart"/>
       <w:r>
         <w:t>ETC</w:t>
       </w:r>
@@ -1752,6 +2041,7 @@
       <w:r>
         <w:t>s</w:t>
       </w:r>
+      <w:proofErr w:type="spellEnd"/>
       <w:r>
         <w:t xml:space="preserve"> aan baas</w:t>
       </w:r>
@@ -1759,7 +2049,9 @@
     <w:p>
       <w:pPr>
         <w:pStyle w:val="Heading1"/>
-        <w:rPr/>
+        <w:rPr>
+          <w:ins w:author="Rinse Cramer" w:date="2025-12-13T10:48:00Z" w16du:dateUtc="2025-12-13T09:48:00Z" w:id="220"/>
+        </w:rPr>
       </w:pPr>
       <w:r>
         <w:rPr>
@@ -1829,7 +2121,9 @@
           <w:ilvl w:val="0"/>
           <w:numId w:val="1"/>
         </w:numPr>
-        <w:rPr/>
+        <w:rPr>
+          <w:ins w:author="Rinse Cramer" w:date="2025-12-13T10:57:00Z" w16du:dateUtc="2025-12-13T09:57:00Z" w:id="225"/>
+        </w:rPr>
       </w:pPr>
       <w:r>
         <w:t xml:space="preserve">1. </w:t>
@@ -1840,9 +2134,11 @@
       <w:r>
         <w:t xml:space="preserve">vertelt oplossingsrichting, deliverables en </w:t>
       </w:r>
+      <w:proofErr w:type="spellStart"/>
       <w:r>
         <w:t>ETC’s</w:t>
       </w:r>
+      <w:proofErr w:type="spellEnd"/>
       <w:r>
         <w:t xml:space="preserve"> aan </w:t>
       </w:r>
@@ -1857,7 +2153,9 @@
           <w:ilvl w:val="0"/>
           <w:numId w:val="1"/>
         </w:numPr>
-        <w:rPr/>
+        <w:rPr>
+          <w:ins w:author="Rinse Cramer" w:date="2025-12-13T10:48:00Z" w16du:dateUtc="2025-12-13T09:48:00Z" w:id="229"/>
+        </w:rPr>
       </w:pPr>
       <w:r>
         <w:t xml:space="preserve">2. Baas vertelt </w:t>
@@ -1881,7 +2179,9 @@
     <w:p>
       <w:pPr>
         <w:pStyle w:val="Heading1"/>
-        <w:rPr/>
+        <w:rPr>
+          <w:ins w:author="Rinse Cramer" w:date="2025-12-13T10:48:00Z" w16du:dateUtc="2025-12-13T09:48:00Z" w:id="233"/>
+        </w:rPr>
       </w:pPr>
       <w:r>
         <w:rPr>
@@ -1954,7 +2254,9 @@
           <w:ilvl w:val="0"/>
           <w:numId w:val="1"/>
         </w:numPr>
-        <w:rPr/>
+        <w:rPr>
+          <w:ins w:author="Rinse Cramer" w:date="2025-12-13T10:48:00Z" w16du:dateUtc="2025-12-13T09:48:00Z" w:id="239"/>
+        </w:rPr>
       </w:pPr>
       <w:r>
         <w:t xml:space="preserve">1. </w:t>
@@ -1966,7 +2268,9 @@
     <w:p>
       <w:pPr>
         <w:pStyle w:val="Heading1"/>
-        <w:rPr/>
+        <w:rPr>
+          <w:ins w:author="Rinse Cramer" w:date="2025-12-13T10:48:00Z" w16du:dateUtc="2025-12-13T09:48:00Z" w:id="242"/>
+        </w:rPr>
       </w:pPr>
       <w:r>
         <w:rPr>
@@ -2037,7 +2341,9 @@
           <w:ilvl w:val="0"/>
           <w:numId w:val="1"/>
         </w:numPr>
-        <w:rPr/>
+        <w:rPr>
+          <w:ins w:author="Rinse Cramer" w:date="2025-12-13T10:48:00Z" w16du:dateUtc="2025-12-13T09:48:00Z" w:id="247"/>
+        </w:rPr>
       </w:pPr>
       <w:r>
         <w:t xml:space="preserve">1. </w:t>
@@ -2051,7 +2357,18 @@
     </w:p>
     <w:p>
       <w:pPr>
-        <w:rPr/>
+        <w:rPr>
+          <w:ins w:author="Rinse Cramer" w:date="2025-12-12T15:02:00Z" w16du:dateUtc="2025-12-12T14:02:00Z" w:id="251"/>
+        </w:rPr>
+        <w:pPrChange w:author="Rinse Cramer" w:date="2025-12-13T10:48:00Z" w16du:dateUtc="2025-12-13T09:48:00Z" w:id="252">
+          <w:pPr>
+            <w:pStyle w:val="ListParagraph"/>
+            <w:numPr>
+              <w:numId w:val="1"/>
+            </w:numPr>
+            <w:ind w:hanging="360"/>
+          </w:pPr>
+        </w:pPrChange>
       </w:pPr>
     </w:p>
     <w:p>
@@ -2070,7 +2387,9 @@
     <w:p>
       <w:pPr>
         <w:pStyle w:val="Heading1"/>
-        <w:rPr/>
+        <w:rPr>
+          <w:del w:author="Rinse Cramer" w:date="2025-11-24T23:59:00Z" w16du:dateUtc="2025-11-24T22:59:00Z" w:id="253"/>
+        </w:rPr>
       </w:pPr>
     </w:p>
     <w:p>
@@ -2080,7 +2399,9 @@
           <w:ilvl w:val="0"/>
           <w:numId w:val="2"/>
         </w:numPr>
-        <w:rPr/>
+        <w:rPr>
+          <w:del w:author="Rinse Cramer" w:date="2025-11-24T23:59:00Z" w16du:dateUtc="2025-11-24T22:59:00Z" w:id="255"/>
+        </w:rPr>
       </w:pPr>
     </w:p>
     <w:p>
@@ -2090,7 +2411,9 @@
           <w:ilvl w:val="0"/>
           <w:numId w:val="1"/>
         </w:numPr>
-        <w:rPr/>
+        <w:rPr>
+          <w:del w:author="Rinse Cramer" w:date="2025-11-24T23:59:00Z" w16du:dateUtc="2025-11-24T22:59:00Z" w:id="257"/>
+        </w:rPr>
       </w:pPr>
     </w:p>
     <w:p>
@@ -2100,7 +2423,9 @@
           <w:ilvl w:val="0"/>
           <w:numId w:val="2"/>
         </w:numPr>
-        <w:rPr/>
+        <w:rPr>
+          <w:del w:author="Rinse Cramer" w:date="2025-11-24T23:59:00Z" w16du:dateUtc="2025-11-24T22:59:00Z" w:id="259"/>
+        </w:rPr>
       </w:pPr>
     </w:p>
     <w:p>
@@ -2110,7 +2435,9 @@
           <w:ilvl w:val="0"/>
           <w:numId w:val="1"/>
         </w:numPr>
-        <w:rPr/>
+        <w:rPr>
+          <w:del w:author="Rinse Cramer" w:date="2025-11-24T23:59:00Z" w16du:dateUtc="2025-11-24T22:59:00Z" w:id="261"/>
+        </w:rPr>
       </w:pPr>
     </w:p>
     <w:p>
@@ -2120,7 +2447,9 @@
           <w:ilvl w:val="0"/>
           <w:numId w:val="4"/>
         </w:numPr>
-        <w:rPr/>
+        <w:rPr>
+          <w:del w:author="Rinse Cramer" w:date="2025-11-24T23:59:00Z" w16du:dateUtc="2025-11-24T22:59:00Z" w:id="263"/>
+        </w:rPr>
       </w:pPr>
     </w:p>
     <w:p>
@@ -2130,7 +2459,9 @@
           <w:ilvl w:val="0"/>
           <w:numId w:val="1"/>
         </w:numPr>
-        <w:rPr/>
+        <w:rPr>
+          <w:del w:author="Rinse Cramer" w:date="2025-11-24T23:59:00Z" w16du:dateUtc="2025-11-24T22:59:00Z" w:id="265"/>
+        </w:rPr>
       </w:pPr>
     </w:p>
     <w:p>
@@ -2140,7 +2471,9 @@
           <w:ilvl w:val="0"/>
           <w:numId w:val="4"/>
         </w:numPr>
-        <w:rPr/>
+        <w:rPr>
+          <w:del w:author="Rinse Cramer" w:date="2025-11-24T23:59:00Z" w16du:dateUtc="2025-11-24T22:59:00Z" w:id="267"/>
+        </w:rPr>
       </w:pPr>
     </w:p>
     <w:p>
@@ -2150,7 +2483,9 @@
           <w:ilvl w:val="0"/>
           <w:numId w:val="1"/>
         </w:numPr>
-        <w:rPr/>
+        <w:rPr>
+          <w:del w:author="Rinse Cramer" w:date="2025-11-24T23:59:00Z" w16du:dateUtc="2025-11-24T22:59:00Z" w:id="269"/>
+        </w:rPr>
       </w:pPr>
     </w:p>
     <w:p>
@@ -2160,7 +2495,9 @@
           <w:ilvl w:val="0"/>
           <w:numId w:val="4"/>
         </w:numPr>
-        <w:rPr/>
+        <w:rPr>
+          <w:del w:author="Rinse Cramer" w:date="2025-11-24T23:59:00Z" w16du:dateUtc="2025-11-24T22:59:00Z" w:id="271"/>
+        </w:rPr>
       </w:pPr>
     </w:p>
     <w:p>
@@ -2170,7 +2507,9 @@
           <w:ilvl w:val="0"/>
           <w:numId w:val="1"/>
         </w:numPr>
-        <w:rPr/>
+        <w:rPr>
+          <w:del w:author="Rinse Cramer" w:date="2025-11-24T23:59:00Z" w16du:dateUtc="2025-11-24T22:59:00Z" w:id="273"/>
+        </w:rPr>
       </w:pPr>
     </w:p>
     <w:p>
@@ -2180,7 +2519,9 @@
           <w:ilvl w:val="0"/>
           <w:numId w:val="2"/>
         </w:numPr>
-        <w:rPr/>
+        <w:rPr>
+          <w:del w:author="Rinse Cramer" w:date="2025-11-24T23:59:00Z" w16du:dateUtc="2025-11-24T22:59:00Z" w:id="275"/>
+        </w:rPr>
       </w:pPr>
     </w:p>
     <w:p>
@@ -2190,7 +2531,9 @@
           <w:ilvl w:val="0"/>
           <w:numId w:val="1"/>
         </w:numPr>
-        <w:rPr/>
+        <w:rPr>
+          <w:del w:author="Rinse Cramer" w:date="2025-11-24T23:59:00Z" w16du:dateUtc="2025-11-24T22:59:00Z" w:id="277"/>
+        </w:rPr>
       </w:pPr>
     </w:p>
     <w:p>
@@ -2200,7 +2543,9 @@
           <w:ilvl w:val="0"/>
           <w:numId w:val="2"/>
         </w:numPr>
-        <w:rPr/>
+        <w:rPr>
+          <w:del w:author="Rinse Cramer" w:date="2025-11-24T23:59:00Z" w16du:dateUtc="2025-11-24T22:59:00Z" w:id="279"/>
+        </w:rPr>
       </w:pPr>
     </w:p>
     <w:p>
@@ -2210,7 +2555,9 @@
           <w:ilvl w:val="0"/>
           <w:numId w:val="1"/>
         </w:numPr>
-        <w:rPr/>
+        <w:rPr>
+          <w:del w:author="Rinse Cramer" w:date="2025-11-24T23:59:00Z" w16du:dateUtc="2025-11-24T22:59:00Z" w:id="281"/>
+        </w:rPr>
       </w:pPr>
     </w:p>
     <w:p>
@@ -2220,7 +2567,9 @@
           <w:ilvl w:val="0"/>
           <w:numId w:val="2"/>
         </w:numPr>
-        <w:rPr/>
+        <w:rPr>
+          <w:del w:author="Rinse Cramer" w:date="2025-11-24T23:59:00Z" w16du:dateUtc="2025-11-24T22:59:00Z" w:id="283"/>
+        </w:rPr>
       </w:pPr>
     </w:p>
     <w:p>
@@ -2230,7 +2579,9 @@
           <w:ilvl w:val="0"/>
           <w:numId w:val="1"/>
         </w:numPr>
-        <w:rPr/>
+        <w:rPr>
+          <w:del w:author="Rinse Cramer" w:date="2025-11-24T23:59:00Z" w16du:dateUtc="2025-11-24T22:59:00Z" w:id="285"/>
+        </w:rPr>
       </w:pPr>
     </w:p>
     <w:p>
@@ -2311,9 +2662,11 @@
       <w:r>
         <w:t xml:space="preserve">Sta in de schoenen van de ontvanger van een opmerking in </w:t>
       </w:r>
+      <w:proofErr w:type="spellStart"/>
       <w:r>
         <w:t>Jira</w:t>
       </w:r>
+      <w:proofErr w:type="spellEnd"/>
     </w:p>
     <w:p>
       <w:pPr>
@@ -2397,9 +2750,11 @@
       <w:r>
         <w:t xml:space="preserve">Is de root </w:t>
       </w:r>
+      <w:proofErr w:type="spellStart"/>
       <w:r>
         <w:t>cause</w:t>
       </w:r>
+      <w:proofErr w:type="spellEnd"/>
       <w:r>
         <w:t xml:space="preserve"> van het probleem bekend?</w:t>
       </w:r>
@@ -2467,7 +2822,9 @@
           <w:ilvl w:val="1"/>
           <w:numId w:val="6"/>
         </w:numPr>
-        <w:rPr/>
+        <w:rPr>
+          <w:ins w:author="Rinse Cramer" w:date="2025-11-04T23:01:00Z" w16du:dateUtc="2025-11-04T22:01:00Z" w:id="287"/>
+        </w:rPr>
       </w:pPr>
       <w:r>
         <w:t>Is er een handleiding?</w:t>
@@ -2480,7 +2837,9 @@
           <w:ilvl w:val="0"/>
           <w:numId w:val="6"/>
         </w:numPr>
-        <w:rPr/>
+        <w:rPr>
+          <w:ins w:author="Rinse Cramer" w:date="2025-11-04T23:02:00Z" w16du:dateUtc="2025-11-04T22:02:00Z" w:id="288"/>
+        </w:rPr>
       </w:pPr>
       <w:r>
         <w:t xml:space="preserve">3. </w:t>
@@ -2549,6 +2908,7 @@
       <w:pPr>
         <w:pStyle w:val="Heading1"/>
         <w:rPr>
+          <w:del w:author="Rinse Cramer" w:date="2025-11-07T18:11:00Z" w16du:dateUtc="2025-11-07T17:11:00Z" w:id="292"/>
           <w:rFonts w:ascii="Segoe UI Emoji" w:hAnsi="Segoe UI Emoji" w:cs="Segoe UI Emoji"/>
         </w:rPr>
       </w:pPr>
@@ -2560,7 +2920,9 @@
           <w:ilvl w:val="0"/>
           <w:numId w:val="8"/>
         </w:numPr>
-        <w:rPr/>
+        <w:rPr>
+          <w:del w:author="Rinse Cramer" w:date="2025-11-07T18:11:00Z" w16du:dateUtc="2025-11-07T17:11:00Z" w:id="294"/>
+        </w:rPr>
       </w:pPr>
     </w:p>
     <w:p>
@@ -2570,7 +2932,9 @@
           <w:ilvl w:val="1"/>
           <w:numId w:val="1"/>
         </w:numPr>
-        <w:rPr/>
+        <w:rPr>
+          <w:del w:author="Rinse Cramer" w:date="2025-11-07T18:11:00Z" w16du:dateUtc="2025-11-07T17:11:00Z" w:id="296"/>
+        </w:rPr>
       </w:pPr>
     </w:p>
     <w:p>
@@ -2580,7 +2944,9 @@
           <w:ilvl w:val="0"/>
           <w:numId w:val="1"/>
         </w:numPr>
-        <w:rPr/>
+        <w:rPr>
+          <w:del w:author="Rinse Cramer" w:date="2025-11-07T18:11:00Z" w16du:dateUtc="2025-11-07T17:11:00Z" w:id="298"/>
+        </w:rPr>
       </w:pPr>
     </w:p>
     <w:p>
@@ -2590,7 +2956,9 @@
           <w:ilvl w:val="1"/>
           <w:numId w:val="1"/>
         </w:numPr>
-        <w:rPr/>
+        <w:rPr>
+          <w:del w:author="Rinse Cramer" w:date="2025-11-07T18:11:00Z" w16du:dateUtc="2025-11-07T17:11:00Z" w:id="300"/>
+        </w:rPr>
       </w:pPr>
     </w:p>
     <w:p>
@@ -2600,7 +2968,9 @@
           <w:ilvl w:val="0"/>
           <w:numId w:val="1"/>
         </w:numPr>
-        <w:rPr/>
+        <w:rPr>
+          <w:del w:author="Rinse Cramer" w:date="2025-11-07T18:11:00Z" w16du:dateUtc="2025-11-07T17:11:00Z" w:id="302"/>
+        </w:rPr>
       </w:pPr>
     </w:p>
     <w:p>
@@ -2610,7 +2980,9 @@
           <w:ilvl w:val="1"/>
           <w:numId w:val="1"/>
         </w:numPr>
-        <w:rPr/>
+        <w:rPr>
+          <w:del w:author="Rinse Cramer" w:date="2025-11-07T18:11:00Z" w16du:dateUtc="2025-11-07T17:11:00Z" w:id="304"/>
+        </w:rPr>
       </w:pPr>
     </w:p>
     <w:p>
@@ -2904,7 +3276,9 @@
           <w:ilvl w:val="0"/>
           <w:numId w:val="12"/>
         </w:numPr>
-        <w:rPr/>
+        <w:rPr>
+          <w:ins w:author="Rinse Cramer" w:date="2025-11-24T23:58:00Z" w16du:dateUtc="2025-11-24T22:58:00Z" w:id="310"/>
+        </w:rPr>
       </w:pPr>
       <w:r>
         <w:t xml:space="preserve">3. </w:t>
@@ -2916,7 +3290,9 @@
     <w:p>
       <w:pPr>
         <w:pStyle w:val="Heading2"/>
-        <w:rPr/>
+        <w:rPr>
+          <w:ins w:author="Rinse Cramer" w:date="2025-11-24T23:58:00Z" w16du:dateUtc="2025-11-24T22:58:00Z" w:id="311"/>
+        </w:rPr>
       </w:pPr>
       <w:r>
         <w:t>c. Heb ik mijn antwoorden getest voordat ik JW spreek?</w:t>
@@ -2929,6 +3305,15 @@
           <w:ilvl w:val="0"/>
           <w:numId w:val="35"/>
         </w:numPr>
+        <w:pPrChange w:author="Rinse Cramer" w:date="2025-11-24T23:58:00Z" w16du:dateUtc="2025-11-24T22:58:00Z" w:id="313">
+          <w:pPr>
+            <w:pStyle w:val="ListParagraph"/>
+            <w:numPr>
+              <w:numId w:val="12"/>
+            </w:numPr>
+            <w:ind w:hanging="360"/>
+          </w:pPr>
+        </w:pPrChange>
       </w:pPr>
       <w:r>
         <w:t>1. Heb ik de grootste oorzaak kunnen vinden?</w:t>
@@ -2950,7 +3335,9 @@
     <w:p>
       <w:pPr>
         <w:pStyle w:val="Heading1"/>
-        <w:rPr/>
+        <w:rPr>
+          <w:del w:author="Rinse Cramer" w:date="2025-11-25T00:00:00Z" w16du:dateUtc="2025-11-24T23:00:00Z" w:id="315"/>
+        </w:rPr>
       </w:pPr>
     </w:p>
     <w:p>
@@ -2960,7 +3347,9 @@
           <w:ilvl w:val="0"/>
           <w:numId w:val="1"/>
         </w:numPr>
-        <w:rPr/>
+        <w:rPr>
+          <w:del w:author="Rinse Cramer" w:date="2025-11-25T00:00:00Z" w16du:dateUtc="2025-11-24T23:00:00Z" w:id="317"/>
+        </w:rPr>
       </w:pPr>
     </w:p>
     <w:p>
@@ -2970,13 +3359,16 @@
           <w:ilvl w:val="1"/>
           <w:numId w:val="1"/>
         </w:numPr>
-        <w:rPr/>
+        <w:rPr>
+          <w:del w:author="Rinse Cramer" w:date="2025-11-25T00:00:00Z" w16du:dateUtc="2025-11-24T23:00:00Z" w:id="319"/>
+        </w:rPr>
       </w:pPr>
     </w:p>
     <w:p>
       <w:pPr>
         <w:pStyle w:val="Heading1"/>
         <w:rPr>
+          <w:del w:author="Rinse Cramer" w:date="2025-11-25T00:00:00Z" w16du:dateUtc="2025-11-24T23:00:00Z" w:id="321"/>
           <w:rFonts w:ascii="Segoe UI Emoji" w:hAnsi="Segoe UI Emoji" w:cs="Segoe UI Emoji"/>
         </w:rPr>
       </w:pPr>
@@ -2988,13 +3380,16 @@
           <w:ilvl w:val="0"/>
           <w:numId w:val="1"/>
         </w:numPr>
-        <w:rPr/>
+        <w:rPr>
+          <w:del w:author="Rinse Cramer" w:date="2025-11-25T00:00:00Z" w16du:dateUtc="2025-11-24T23:00:00Z" w:id="323"/>
+        </w:rPr>
       </w:pPr>
     </w:p>
     <w:p>
       <w:pPr>
         <w:pStyle w:val="Heading1"/>
         <w:rPr>
+          <w:del w:author="Rinse Cramer" w:date="2025-11-25T00:00:00Z" w16du:dateUtc="2025-11-24T23:00:00Z" w:id="325"/>
           <w:rFonts w:ascii="Segoe UI Emoji" w:hAnsi="Segoe UI Emoji" w:cs="Segoe UI Emoji"/>
         </w:rPr>
       </w:pPr>
@@ -3006,7 +3401,9 @@
           <w:ilvl w:val="0"/>
           <w:numId w:val="8"/>
         </w:numPr>
-        <w:rPr/>
+        <w:rPr>
+          <w:del w:author="Rinse Cramer" w:date="2025-11-25T00:00:00Z" w16du:dateUtc="2025-11-24T23:00:00Z" w:id="327"/>
+        </w:rPr>
       </w:pPr>
     </w:p>
     <w:p>
@@ -3016,13 +3413,16 @@
           <w:ilvl w:val="1"/>
           <w:numId w:val="8"/>
         </w:numPr>
-        <w:rPr/>
+        <w:rPr>
+          <w:del w:author="Rinse Cramer" w:date="2025-11-25T00:00:00Z" w16du:dateUtc="2025-11-24T23:00:00Z" w:id="329"/>
+        </w:rPr>
       </w:pPr>
     </w:p>
     <w:p>
       <w:pPr>
         <w:pStyle w:val="Heading1"/>
         <w:rPr>
+          <w:del w:author="Rinse Cramer" w:date="2025-11-25T00:00:00Z" w16du:dateUtc="2025-11-24T23:00:00Z" w:id="331"/>
           <w:rFonts w:ascii="Segoe UI Emoji" w:hAnsi="Segoe UI Emoji" w:cs="Segoe UI Emoji"/>
         </w:rPr>
       </w:pPr>
@@ -3034,13 +3434,16 @@
           <w:ilvl w:val="0"/>
           <w:numId w:val="8"/>
         </w:numPr>
-        <w:rPr/>
+        <w:rPr>
+          <w:del w:author="Rinse Cramer" w:date="2025-11-25T00:00:00Z" w16du:dateUtc="2025-11-24T23:00:00Z" w:id="333"/>
+        </w:rPr>
       </w:pPr>
     </w:p>
     <w:p>
       <w:pPr>
         <w:pStyle w:val="Heading1"/>
         <w:rPr>
+          <w:del w:author="Rinse Cramer" w:date="2025-11-25T00:00:00Z" w16du:dateUtc="2025-11-24T23:00:00Z" w:id="335"/>
           <w:rFonts w:ascii="Segoe UI Emoji" w:hAnsi="Segoe UI Emoji" w:cs="Segoe UI Emoji"/>
         </w:rPr>
       </w:pPr>
@@ -3052,13 +3455,25 @@
           <w:ilvl w:val="1"/>
           <w:numId w:val="8"/>
         </w:numPr>
-        <w:rPr/>
+        <w:rPr>
+          <w:del w:author="Rinse Cramer" w:date="2025-11-25T00:00:00Z" w16du:dateUtc="2025-11-24T23:00:00Z" w:id="337"/>
+        </w:rPr>
+        <w:pPrChange w:author="Rinse Cramer" w:date="2025-11-05T22:25:00Z" w16du:dateUtc="2025-11-05T21:25:00Z" w:id="338">
+          <w:pPr>
+            <w:pStyle w:val="ListParagraph"/>
+            <w:numPr>
+              <w:numId w:val="8"/>
+            </w:numPr>
+            <w:ind w:hanging="360"/>
+          </w:pPr>
+        </w:pPrChange>
       </w:pPr>
     </w:p>
     <w:p>
       <w:pPr>
         <w:pStyle w:val="Heading1"/>
         <w:rPr>
+          <w:del w:author="Rinse Cramer" w:date="2025-11-25T00:00:00Z" w16du:dateUtc="2025-11-24T23:00:00Z" w:id="340"/>
           <w:rFonts w:ascii="Segoe UI Emoji" w:hAnsi="Segoe UI Emoji" w:cs="Segoe UI Emoji"/>
         </w:rPr>
       </w:pPr>
@@ -3070,13 +3485,16 @@
           <w:ilvl w:val="0"/>
           <w:numId w:val="8"/>
         </w:numPr>
-        <w:rPr/>
+        <w:rPr>
+          <w:del w:author="Rinse Cramer" w:date="2025-11-25T00:00:00Z" w16du:dateUtc="2025-11-24T23:00:00Z" w:id="342"/>
+        </w:rPr>
       </w:pPr>
     </w:p>
     <w:p>
       <w:pPr>
         <w:pStyle w:val="Heading1"/>
         <w:rPr>
+          <w:del w:author="Rinse Cramer" w:date="2025-11-25T00:00:00Z" w16du:dateUtc="2025-11-24T23:00:00Z" w:id="344"/>
           <w:rFonts w:ascii="Segoe UI Emoji" w:hAnsi="Segoe UI Emoji" w:cs="Segoe UI Emoji"/>
         </w:rPr>
       </w:pPr>
@@ -3088,13 +3506,16 @@
           <w:ilvl w:val="0"/>
           <w:numId w:val="8"/>
         </w:numPr>
-        <w:rPr/>
+        <w:rPr>
+          <w:del w:author="Rinse Cramer" w:date="2025-11-25T00:00:00Z" w16du:dateUtc="2025-11-24T23:00:00Z" w:id="346"/>
+        </w:rPr>
       </w:pPr>
     </w:p>
     <w:p>
       <w:pPr>
         <w:pStyle w:val="Heading1"/>
         <w:rPr>
+          <w:del w:author="Rinse Cramer" w:date="2025-11-25T00:00:00Z" w16du:dateUtc="2025-11-24T23:00:00Z" w:id="348"/>
           <w:rFonts w:ascii="Segoe UI Emoji" w:hAnsi="Segoe UI Emoji" w:cs="Segoe UI Emoji"/>
         </w:rPr>
       </w:pPr>
@@ -3106,7 +3527,9 @@
           <w:ilvl w:val="0"/>
           <w:numId w:val="1"/>
         </w:numPr>
-        <w:rPr/>
+        <w:rPr>
+          <w:del w:author="Rinse Cramer" w:date="2025-11-25T00:00:00Z" w16du:dateUtc="2025-11-24T23:00:00Z" w:id="350"/>
+        </w:rPr>
       </w:pPr>
     </w:p>
     <w:p>
@@ -3116,7 +3539,9 @@
           <w:ilvl w:val="1"/>
           <w:numId w:val="1"/>
         </w:numPr>
-        <w:rPr/>
+        <w:rPr>
+          <w:del w:author="Rinse Cramer" w:date="2025-11-25T00:00:00Z" w16du:dateUtc="2025-11-24T23:00:00Z" w:id="352"/>
+        </w:rPr>
       </w:pPr>
     </w:p>
     <w:p>
@@ -3126,7 +3551,9 @@
           <w:ilvl w:val="0"/>
           <w:numId w:val="1"/>
         </w:numPr>
-        <w:rPr/>
+        <w:rPr>
+          <w:del w:author="Rinse Cramer" w:date="2025-11-25T00:00:00Z" w16du:dateUtc="2025-11-24T23:00:00Z" w:id="354"/>
+        </w:rPr>
       </w:pPr>
     </w:p>
     <w:p>
@@ -3136,7 +3563,9 @@
           <w:ilvl w:val="1"/>
           <w:numId w:val="8"/>
         </w:numPr>
-        <w:rPr/>
+        <w:rPr>
+          <w:del w:author="Rinse Cramer" w:date="2025-11-25T00:00:00Z" w16du:dateUtc="2025-11-24T23:00:00Z" w:id="356"/>
+        </w:rPr>
       </w:pPr>
     </w:p>
     <w:p>
@@ -3146,7 +3575,9 @@
           <w:ilvl w:val="0"/>
           <w:numId w:val="8"/>
         </w:numPr>
-        <w:rPr/>
+        <w:rPr>
+          <w:del w:author="Rinse Cramer" w:date="2025-11-25T00:00:00Z" w16du:dateUtc="2025-11-24T23:00:00Z" w:id="358"/>
+        </w:rPr>
       </w:pPr>
     </w:p>
     <w:p>
@@ -3177,7 +3608,9 @@
           <w:ilvl w:val="0"/>
           <w:numId w:val="14"/>
         </w:numPr>
-        <w:rPr/>
+        <w:rPr>
+          <w:ins w:author="Rinse Cramer" w:date="2025-11-04T23:04:00Z" w16du:dateUtc="2025-11-04T22:04:00Z" w:id="360"/>
+        </w:rPr>
       </w:pPr>
       <w:r>
         <w:t xml:space="preserve">1. </w:t>
@@ -3193,7 +3626,9 @@
           <w:ilvl w:val="0"/>
           <w:numId w:val="14"/>
         </w:numPr>
-        <w:rPr/>
+        <w:rPr>
+          <w:ins w:author="Rinse Cramer" w:date="2025-11-10T23:02:00Z" w16du:dateUtc="2025-11-10T22:02:00Z" w:id="361"/>
+        </w:rPr>
       </w:pPr>
       <w:r>
         <w:t>2. He</w:t>
@@ -3218,6 +3653,7 @@
       <w:pPr>
         <w:pStyle w:val="Heading1"/>
         <w:rPr>
+          <w:del w:author="Rinse Cramer" w:date="2025-11-10T23:02:00Z" w16du:dateUtc="2025-11-10T22:02:00Z" w:id="365"/>
           <w:rFonts w:ascii="Segoe UI Emoji" w:hAnsi="Segoe UI Emoji" w:cs="Segoe UI Emoji"/>
         </w:rPr>
       </w:pPr>
@@ -3229,7 +3665,9 @@
           <w:ilvl w:val="0"/>
           <w:numId w:val="14"/>
         </w:numPr>
-        <w:rPr/>
+        <w:rPr>
+          <w:del w:author="Rinse Cramer" w:date="2025-11-10T23:02:00Z" w16du:dateUtc="2025-11-10T22:02:00Z" w:id="367"/>
+        </w:rPr>
       </w:pPr>
     </w:p>
     <w:p>
@@ -3239,7 +3677,9 @@
           <w:ilvl w:val="1"/>
           <w:numId w:val="14"/>
         </w:numPr>
-        <w:rPr/>
+        <w:rPr>
+          <w:del w:author="Rinse Cramer" w:date="2025-11-10T23:02:00Z" w16du:dateUtc="2025-11-10T22:02:00Z" w:id="369"/>
+        </w:rPr>
       </w:pPr>
     </w:p>
     <w:p>
@@ -3303,9 +3743,11 @@
       <w:r>
         <w:t xml:space="preserve">Geen versimpeling doorvoeren bij </w:t>
       </w:r>
+      <w:proofErr w:type="spellStart"/>
       <w:r>
         <w:t>bugfixes</w:t>
       </w:r>
+      <w:proofErr w:type="spellEnd"/>
     </w:p>
     <w:p>
       <w:pPr>
@@ -3314,14 +3756,18 @@
           <w:ilvl w:val="1"/>
           <w:numId w:val="6"/>
         </w:numPr>
-        <w:rPr/>
+        <w:rPr>
+          <w:ins w:author="Rinse Cramer" w:date="2025-11-04T23:02:00Z" w16du:dateUtc="2025-11-04T22:02:00Z" w:id="373"/>
+        </w:rPr>
       </w:pPr>
       <w:r>
         <w:t xml:space="preserve">Verzamel deze voor toekomstige </w:t>
       </w:r>
+      <w:proofErr w:type="spellStart"/>
       <w:r>
         <w:t>refactor</w:t>
       </w:r>
+      <w:proofErr w:type="spellEnd"/>
       <w:r>
         <w:t xml:space="preserve"> issues</w:t>
       </w:r>
@@ -3333,7 +3779,9 @@
           <w:ilvl w:val="0"/>
           <w:numId w:val="6"/>
         </w:numPr>
-        <w:rPr/>
+        <w:rPr>
+          <w:ins w:author="Rinse Cramer" w:date="2025-11-04T23:02:00Z" w16du:dateUtc="2025-11-04T22:02:00Z" w:id="374"/>
+        </w:rPr>
       </w:pPr>
       <w:r>
         <w:t>3. Heb ik een voorstel gedaan op het moment dat ik denk dat het, om welke reden dan ook, anders kan?</w:t>
@@ -3376,12 +3824,14 @@
         </w:rPr>
         <w:t xml:space="preserve"/>
       </w:r>
+      <w:proofErr w:type="spellStart"/>
       <w:r>
         <w:rPr>
           <w:rFonts w:ascii="Segoe UI Emoji" w:hAnsi="Segoe UI Emoji" w:cs="Segoe UI Emoji"/>
         </w:rPr>
         <w:t/>
       </w:r>
+      <w:proofErr w:type="spellEnd"/>
       <w:r>
         <w:rPr>
           <w:rFonts w:ascii="Segoe UI Emoji" w:hAnsi="Segoe UI Emoji" w:cs="Segoe UI Emoji"/>
@@ -3396,7 +3846,9 @@
           <w:ilvl w:val="0"/>
           <w:numId w:val="15"/>
         </w:numPr>
-        <w:rPr/>
+        <w:rPr>
+          <w:ins w:author="Rinse Cramer" w:date="2025-11-05T23:28:00Z" w16du:dateUtc="2025-11-05T22:28:00Z" w:id="379"/>
+        </w:rPr>
       </w:pPr>
       <w:r>
         <w:t xml:space="preserve">1. </w:t>
@@ -3412,6 +3864,15 @@
           <w:ilvl w:val="1"/>
           <w:numId w:val="15"/>
         </w:numPr>
+        <w:pPrChange w:author="Rinse Cramer" w:date="2025-11-05T23:28:00Z" w16du:dateUtc="2025-11-05T22:28:00Z" w:id="380">
+          <w:pPr>
+            <w:pStyle w:val="ListParagraph"/>
+            <w:numPr>
+              <w:numId w:val="15"/>
+            </w:numPr>
+            <w:ind w:hanging="360"/>
+          </w:pPr>
+        </w:pPrChange>
       </w:pPr>
       <w:r>
         <w:t xml:space="preserve">Niet inschatten als er een executie </w:t>
@@ -3539,6 +4000,7 @@
       <w:pPr>
         <w:pStyle w:val="Heading1"/>
         <w:rPr>
+          <w:del w:author="Rinse Cramer" w:date="2025-11-07T18:12:00Z" w16du:dateUtc="2025-11-07T17:12:00Z" w:id="386"/>
           <w:rFonts w:ascii="Segoe UI Emoji" w:hAnsi="Segoe UI Emoji" w:cs="Segoe UI Emoji"/>
         </w:rPr>
       </w:pPr>
@@ -3550,7 +4012,9 @@
           <w:ilvl w:val="0"/>
           <w:numId w:val="16"/>
         </w:numPr>
-        <w:rPr/>
+        <w:rPr>
+          <w:del w:author="Rinse Cramer" w:date="2025-11-07T18:12:00Z" w16du:dateUtc="2025-11-07T17:12:00Z" w:id="388"/>
+        </w:rPr>
       </w:pPr>
     </w:p>
     <w:p>
@@ -3560,7 +4024,9 @@
           <w:ilvl w:val="1"/>
           <w:numId w:val="16"/>
         </w:numPr>
-        <w:rPr/>
+        <w:rPr>
+          <w:del w:author="Rinse Cramer" w:date="2025-11-07T18:12:00Z" w16du:dateUtc="2025-11-07T17:12:00Z" w:id="390"/>
+        </w:rPr>
       </w:pPr>
     </w:p>
     <w:p>
@@ -3790,7 +4256,9 @@
           <w:ilvl w:val="0"/>
           <w:numId w:val="9"/>
         </w:numPr>
-        <w:rPr/>
+        <w:rPr>
+          <w:ins w:author="Rinse Cramer" w:date="2025-11-25T00:00:00Z" w16du:dateUtc="2025-11-24T23:00:00Z" w:id="396"/>
+        </w:rPr>
       </w:pPr>
       <w:r>
         <w:t xml:space="preserve">2. </w:t>
@@ -3802,7 +4270,9 @@
     <w:p>
       <w:pPr>
         <w:pStyle w:val="Heading2"/>
-        <w:rPr/>
+        <w:rPr>
+          <w:ins w:author="Rinse Cramer" w:date="2025-11-25T00:00:00Z" w16du:dateUtc="2025-11-24T23:00:00Z" w:id="397"/>
+        </w:rPr>
       </w:pPr>
       <w:r>
         <w:t>c. He</w:t>
@@ -3818,6 +4288,15 @@
           <w:ilvl w:val="0"/>
           <w:numId w:val="36"/>
         </w:numPr>
+        <w:pPrChange w:author="Rinse Cramer" w:date="2025-11-25T00:00:00Z" w16du:dateUtc="2025-11-24T23:00:00Z" w:id="399">
+          <w:pPr>
+            <w:pStyle w:val="ListParagraph"/>
+            <w:numPr>
+              <w:numId w:val="9"/>
+            </w:numPr>
+            <w:ind w:hanging="360"/>
+          </w:pPr>
+        </w:pPrChange>
       </w:pPr>
       <w:r>
         <w:t>1. Heb ik de grootste oorzaak kunnen vinden?</w:t>
@@ -3843,6 +4322,7 @@
       <w:pPr>
         <w:pStyle w:val="Heading1"/>
         <w:rPr>
+          <w:del w:author="Rinse Cramer" w:date="2025-11-25T00:03:00Z" w16du:dateUtc="2025-11-24T23:03:00Z" w:id="401"/>
           <w:rFonts w:ascii="Segoe UI Emoji" w:hAnsi="Segoe UI Emoji" w:cs="Segoe UI Emoji"/>
         </w:rPr>
       </w:pPr>
@@ -3854,7 +4334,9 @@
           <w:ilvl w:val="0"/>
           <w:numId w:val="1"/>
         </w:numPr>
-        <w:rPr/>
+        <w:rPr>
+          <w:del w:author="Rinse Cramer" w:date="2025-11-25T00:03:00Z" w16du:dateUtc="2025-11-24T23:03:00Z" w:id="403"/>
+        </w:rPr>
       </w:pPr>
     </w:p>
     <w:p>
@@ -3864,13 +4346,16 @@
           <w:ilvl w:val="0"/>
           <w:numId w:val="17"/>
         </w:numPr>
-        <w:rPr/>
+        <w:rPr>
+          <w:del w:author="Rinse Cramer" w:date="2025-11-25T00:03:00Z" w16du:dateUtc="2025-11-24T23:03:00Z" w:id="405"/>
+        </w:rPr>
       </w:pPr>
     </w:p>
     <w:p>
       <w:pPr>
         <w:pStyle w:val="Heading1"/>
         <w:rPr>
+          <w:del w:author="Rinse Cramer" w:date="2025-11-25T00:03:00Z" w16du:dateUtc="2025-11-24T23:03:00Z" w:id="407"/>
           <w:rFonts w:ascii="Segoe UI Emoji" w:hAnsi="Segoe UI Emoji" w:cs="Segoe UI Emoji"/>
         </w:rPr>
       </w:pPr>
@@ -3882,7 +4367,9 @@
           <w:ilvl w:val="0"/>
           <w:numId w:val="15"/>
         </w:numPr>
-        <w:rPr/>
+        <w:rPr>
+          <w:del w:author="Rinse Cramer" w:date="2025-11-25T00:03:00Z" w16du:dateUtc="2025-11-24T23:03:00Z" w:id="409"/>
+        </w:rPr>
       </w:pPr>
     </w:p>
     <w:p>
@@ -3892,7 +4379,9 @@
           <w:ilvl w:val="1"/>
           <w:numId w:val="15"/>
         </w:numPr>
-        <w:rPr/>
+        <w:rPr>
+          <w:del w:author="Rinse Cramer" w:date="2025-11-25T00:03:00Z" w16du:dateUtc="2025-11-24T23:03:00Z" w:id="411"/>
+        </w:rPr>
       </w:pPr>
     </w:p>
     <w:p>
@@ -3902,7 +4391,9 @@
           <w:ilvl w:val="0"/>
           <w:numId w:val="15"/>
         </w:numPr>
-        <w:rPr/>
+        <w:rPr>
+          <w:del w:author="Rinse Cramer" w:date="2025-11-25T00:03:00Z" w16du:dateUtc="2025-11-24T23:03:00Z" w:id="413"/>
+        </w:rPr>
       </w:pPr>
     </w:p>
     <w:p>
@@ -3912,7 +4403,9 @@
           <w:ilvl w:val="1"/>
           <w:numId w:val="15"/>
         </w:numPr>
-        <w:rPr/>
+        <w:rPr>
+          <w:del w:author="Rinse Cramer" w:date="2025-11-25T00:03:00Z" w16du:dateUtc="2025-11-24T23:03:00Z" w:id="415"/>
+        </w:rPr>
       </w:pPr>
     </w:p>
     <w:p>
@@ -3922,7 +4415,9 @@
           <w:ilvl w:val="0"/>
           <w:numId w:val="9"/>
         </w:numPr>
-        <w:rPr/>
+        <w:rPr>
+          <w:del w:author="Rinse Cramer" w:date="2025-11-25T00:03:00Z" w16du:dateUtc="2025-11-24T23:03:00Z" w:id="417"/>
+        </w:rPr>
       </w:pPr>
     </w:p>
     <w:p>
@@ -3997,9 +4492,11 @@
       <w:r>
         <w:t xml:space="preserve">Voor de module test is het aantal runtime meldingen in zowel het </w:t>
       </w:r>
+      <w:proofErr w:type="spellStart"/>
       <w:r>
         <w:t>mooiweer</w:t>
       </w:r>
+      <w:proofErr w:type="spellEnd"/>
       <w:r>
         <w:t xml:space="preserve">- als het slechtweerscenario </w:t>
       </w:r>
@@ -4015,9 +4512,11 @@
           <w:numId w:val="9"/>
         </w:numPr>
       </w:pPr>
+      <w:proofErr w:type="gramStart"/>
       <w:r>
         <w:t>Indien</w:t>
       </w:r>
+      <w:proofErr w:type="gramEnd"/>
       <w:r>
         <w:t xml:space="preserve"> dit aantal ongelijk is aan nul, is de module test niet afgerond en dient verdere actie worden ondernomen</w:t>
       </w:r>
@@ -4063,15 +4562,19 @@
       <w:r>
         <w:t xml:space="preserve">Geen </w:t>
       </w:r>
+      <w:proofErr w:type="spellStart"/>
       <w:r>
         <w:t>warnings</w:t>
       </w:r>
+      <w:proofErr w:type="spellEnd"/>
       <w:r>
         <w:t>/</w:t>
       </w:r>
+      <w:proofErr w:type="spellStart"/>
       <w:r>
         <w:t>messages</w:t>
       </w:r>
+      <w:proofErr w:type="spellEnd"/>
       <w:r>
         <w:t>?</w:t>
       </w:r>
@@ -4116,9 +4619,11 @@
       <w:r>
         <w:t xml:space="preserve">Test </w:t>
       </w:r>
+      <w:proofErr w:type="spellStart"/>
       <w:r>
         <w:t>boundaries</w:t>
       </w:r>
+      <w:proofErr w:type="spellEnd"/>
     </w:p>
     <w:p>
       <w:pPr>
@@ -4134,9 +4639,11 @@
       <w:r>
         <w:t xml:space="preserve">Geen </w:t>
       </w:r>
+      <w:proofErr w:type="spellStart"/>
       <w:r>
         <w:t>Task</w:t>
       </w:r>
+      <w:proofErr w:type="spellEnd"/>
       <w:r>
         <w:t xml:space="preserve"> gebruiken</w:t>
       </w:r>
@@ -4220,9 +4727,11 @@
       <w:r>
         <w:t xml:space="preserve">Gebruik </w:t>
       </w:r>
+      <w:proofErr w:type="spellStart"/>
       <w:r>
         <w:t>tooling</w:t>
       </w:r>
+      <w:proofErr w:type="spellEnd"/>
       <w:r>
         <w:t xml:space="preserve"> en documenteer extern</w:t>
       </w:r>
@@ -4241,9 +4750,11 @@
       <w:r>
         <w:t xml:space="preserve">Gebruik </w:t>
       </w:r>
+      <w:proofErr w:type="spellStart"/>
       <w:r>
         <w:t>WinMerge</w:t>
       </w:r>
+      <w:proofErr w:type="spellEnd"/>
       <w:r>
         <w:t xml:space="preserve"> als je een ouder issue oppakt</w:t>
       </w:r>
@@ -4255,7 +4766,9 @@
           <w:ilvl w:val="1"/>
           <w:numId w:val="6"/>
         </w:numPr>
-        <w:rPr/>
+        <w:rPr>
+          <w:ins w:author="Rinse Cramer" w:date="2025-11-04T23:03:00Z" w16du:dateUtc="2025-11-04T22:03:00Z" w:id="419"/>
+        </w:rPr>
       </w:pPr>
       <w:r>
         <w:t>Er kunnen in de tussentijd wijzigingen aangebracht zijn</w:t>
@@ -4268,7 +4781,9 @@
           <w:ilvl w:val="0"/>
           <w:numId w:val="6"/>
         </w:numPr>
-        <w:rPr/>
+        <w:rPr>
+          <w:ins w:author="Rinse Cramer" w:date="2025-11-04T23:03:00Z" w16du:dateUtc="2025-11-04T22:03:00Z" w:id="420"/>
+        </w:rPr>
       </w:pPr>
       <w:r>
         <w:t>3. Heb ik een voorstel gedaan op het moment dat ik denk dat het, om welke reden dan ook, anders kan?</w:t>
@@ -4336,9 +4851,11 @@
       <w:r>
         <w:t xml:space="preserve">Heb ik geen </w:t>
       </w:r>
+      <w:proofErr w:type="spellStart"/>
       <w:r>
         <w:t>refactor</w:t>
       </w:r>
+      <w:proofErr w:type="spellEnd"/>
       <w:r>
         <w:t>/clean uitgevoerd?</w:t>
       </w:r>
@@ -4398,9 +4915,11 @@
       <w:r>
         <w:t xml:space="preserve">Is een bijzondere oplossing voorzien van </w:t>
       </w:r>
+      <w:proofErr w:type="spellStart"/>
       <w:r>
         <w:t>van</w:t>
       </w:r>
+      <w:proofErr w:type="spellEnd"/>
       <w:r>
         <w:t xml:space="preserve"> commentaar met de rationale?</w:t>
       </w:r>
@@ -4424,12 +4943,14 @@
         </w:rPr>
         <w:t xml:space="preserve"/>
       </w:r>
+      <w:proofErr w:type="spellStart"/>
       <w:r>
         <w:rPr>
           <w:rFonts w:ascii="Segoe UI Emoji" w:hAnsi="Segoe UI Emoji" w:cs="Segoe UI Emoji"/>
         </w:rPr>
         <w:t/>
       </w:r>
+      <w:proofErr w:type="spellEnd"/>
       <w:r>
         <w:rPr>
           <w:rFonts w:ascii="Segoe UI Emoji" w:hAnsi="Segoe UI Emoji" w:cs="Segoe UI Emoji"/>
@@ -4508,9 +5029,11 @@
           <w:numId w:val="21"/>
         </w:numPr>
       </w:pPr>
+      <w:proofErr w:type="gramStart"/>
       <w:r>
         <w:t>Indien</w:t>
       </w:r>
+      <w:proofErr w:type="gramEnd"/>
       <w:r>
         <w:t xml:space="preserve"> er signalen zijn dat de uitvoering onvoldoende is geweest, verzoek ik dit expliciet te melden via Esther zodat er gericht kan worden bijgestuurd</w:t>
       </w:r>
@@ -4519,6 +5042,7 @@
       <w:pPr>
         <w:pStyle w:val="Heading1"/>
         <w:rPr>
+          <w:del w:author="Rinse Cramer" w:date="2025-11-07T18:12:00Z" w16du:dateUtc="2025-11-07T17:12:00Z" w:id="427"/>
           <w:rFonts w:ascii="Segoe UI Emoji" w:hAnsi="Segoe UI Emoji" w:cs="Segoe UI Emoji"/>
         </w:rPr>
       </w:pPr>
@@ -4530,7 +5054,9 @@
           <w:ilvl w:val="0"/>
           <w:numId w:val="21"/>
         </w:numPr>
-        <w:rPr/>
+        <w:rPr>
+          <w:del w:author="Rinse Cramer" w:date="2025-11-07T18:12:00Z" w16du:dateUtc="2025-11-07T17:12:00Z" w:id="429"/>
+        </w:rPr>
       </w:pPr>
     </w:p>
     <w:p>
@@ -4540,7 +5066,9 @@
           <w:ilvl w:val="1"/>
           <w:numId w:val="21"/>
         </w:numPr>
-        <w:rPr/>
+        <w:rPr>
+          <w:del w:author="Rinse Cramer" w:date="2025-11-07T18:12:00Z" w16du:dateUtc="2025-11-07T17:12:00Z" w:id="431"/>
+        </w:rPr>
       </w:pPr>
     </w:p>
     <w:p>
@@ -4550,7 +5078,9 @@
           <w:ilvl w:val="0"/>
           <w:numId w:val="21"/>
         </w:numPr>
-        <w:rPr/>
+        <w:rPr>
+          <w:del w:author="Rinse Cramer" w:date="2025-11-07T18:12:00Z" w16du:dateUtc="2025-11-07T17:12:00Z" w:id="433"/>
+        </w:rPr>
       </w:pPr>
     </w:p>
     <w:p>
@@ -4560,7 +5090,9 @@
           <w:ilvl w:val="1"/>
           <w:numId w:val="21"/>
         </w:numPr>
-        <w:rPr/>
+        <w:rPr>
+          <w:del w:author="Rinse Cramer" w:date="2025-11-07T18:12:00Z" w16du:dateUtc="2025-11-07T17:12:00Z" w:id="435"/>
+        </w:rPr>
       </w:pPr>
     </w:p>
     <w:p>
@@ -4570,7 +5102,9 @@
           <w:ilvl w:val="0"/>
           <w:numId w:val="21"/>
         </w:numPr>
-        <w:rPr/>
+        <w:rPr>
+          <w:del w:author="Rinse Cramer" w:date="2025-11-07T18:12:00Z" w16du:dateUtc="2025-11-07T17:12:00Z" w:id="437"/>
+        </w:rPr>
       </w:pPr>
     </w:p>
     <w:p>
@@ -4580,7 +5114,9 @@
           <w:ilvl w:val="1"/>
           <w:numId w:val="21"/>
         </w:numPr>
-        <w:rPr/>
+        <w:rPr>
+          <w:del w:author="Rinse Cramer" w:date="2025-11-07T18:12:00Z" w16du:dateUtc="2025-11-07T17:12:00Z" w:id="439"/>
+        </w:rPr>
       </w:pPr>
     </w:p>
     <w:p>
@@ -4590,7 +5126,9 @@
           <w:ilvl w:val="0"/>
           <w:numId w:val="21"/>
         </w:numPr>
-        <w:rPr/>
+        <w:rPr>
+          <w:del w:author="Rinse Cramer" w:date="2025-11-07T18:12:00Z" w16du:dateUtc="2025-11-07T17:12:00Z" w:id="441"/>
+        </w:rPr>
       </w:pPr>
     </w:p>
     <w:p>
@@ -4600,7 +5138,9 @@
           <w:ilvl w:val="1"/>
           <w:numId w:val="21"/>
         </w:numPr>
-        <w:rPr/>
+        <w:rPr>
+          <w:del w:author="Rinse Cramer" w:date="2025-11-07T18:12:00Z" w16du:dateUtc="2025-11-07T17:12:00Z" w:id="443"/>
+        </w:rPr>
       </w:pPr>
     </w:p>
     <w:p>
@@ -4839,7 +5379,9 @@
           <w:ilvl w:val="0"/>
           <w:numId w:val="9"/>
         </w:numPr>
-        <w:rPr/>
+        <w:rPr>
+          <w:ins w:author="Rinse Cramer" w:date="2025-11-25T00:01:00Z" w16du:dateUtc="2025-11-24T23:01:00Z" w:id="449"/>
+        </w:rPr>
       </w:pPr>
       <w:r>
         <w:t xml:space="preserve">2. </w:t>
@@ -4851,7 +5393,9 @@
     <w:p>
       <w:pPr>
         <w:pStyle w:val="Heading2"/>
-        <w:rPr/>
+        <w:rPr>
+          <w:ins w:author="Rinse Cramer" w:date="2025-11-25T00:01:00Z" w16du:dateUtc="2025-11-24T23:01:00Z" w:id="450"/>
+        </w:rPr>
       </w:pPr>
       <w:r>
         <w:t>c. Heb ik mijn antwoorden getest voordat ik JW spreek?</w:t>
@@ -4864,6 +5408,15 @@
           <w:ilvl w:val="0"/>
           <w:numId w:val="37"/>
         </w:numPr>
+        <w:pPrChange w:author="Rinse Cramer" w:date="2025-11-25T00:01:00Z" w16du:dateUtc="2025-11-24T23:01:00Z" w:id="452">
+          <w:pPr>
+            <w:pStyle w:val="ListParagraph"/>
+            <w:numPr>
+              <w:numId w:val="9"/>
+            </w:numPr>
+            <w:ind w:hanging="360"/>
+          </w:pPr>
+        </w:pPrChange>
       </w:pPr>
       <w:r>
         <w:t>1. Heb ik de grootste oorzaak kunnen vinden?</w:t>
@@ -4872,6 +5425,7 @@
     <w:p>
       <w:pPr>
         <w:rPr>
+          <w:ins w:author="Rinse Cramer" w:date="2025-11-07T18:13:00Z" w16du:dateUtc="2025-11-07T17:13:00Z" w:id="454"/>
           <w:rFonts w:ascii="Segoe UI Emoji" w:hAnsi="Segoe UI Emoji" w:cs="Segoe UI Emoji" w:eastAsiaTheme="majorEastAsia"/>
           <w:color w:val="0F4761" w:themeColor="accent1" w:themeShade="BF"/>
           <w:sz w:val="40"/>
@@ -4926,9 +5480,11 @@
       <w:r>
         <w:t xml:space="preserve">Review logs van Bluetooth en </w:t>
       </w:r>
+      <w:proofErr w:type="spellStart"/>
       <w:r>
         <w:t>WiFi</w:t>
       </w:r>
+      <w:proofErr w:type="spellEnd"/>
     </w:p>
     <w:p>
       <w:pPr>
@@ -4944,21 +5500,27 @@
       <w:r>
         <w:t xml:space="preserve">Heb je waarschuwingen over </w:t>
       </w:r>
+      <w:proofErr w:type="spellStart"/>
       <w:r>
         <w:t>BurningHours</w:t>
       </w:r>
+      <w:proofErr w:type="spellEnd"/>
       <w:r>
         <w:t xml:space="preserve"> </w:t>
       </w:r>
+      <w:proofErr w:type="gramStart"/>
       <w:r>
         <w:t>= !65535!,</w:t>
       </w:r>
+      <w:proofErr w:type="gramEnd"/>
       <w:r>
         <w:t xml:space="preserve"> </w:t>
       </w:r>
+      <w:proofErr w:type="spellStart"/>
       <w:r>
         <w:t>Counts</w:t>
       </w:r>
+      <w:proofErr w:type="spellEnd"/>
       <w:r>
         <w:t xml:space="preserve"> = !</w:t>
       </w:r>
@@ -5079,9 +5641,11 @@
       <w:r>
         <w:t xml:space="preserve">Verschillende </w:t>
       </w:r>
+      <w:proofErr w:type="spellStart"/>
       <w:r>
         <w:t>toegangsniveau’s</w:t>
       </w:r>
+      <w:proofErr w:type="spellEnd"/>
     </w:p>
     <w:p>
       <w:pPr>
@@ -5094,9 +5658,11 @@
       <w:r>
         <w:t xml:space="preserve">9. </w:t>
       </w:r>
+      <w:proofErr w:type="spellStart"/>
       <w:r>
         <w:t>Monkey</w:t>
       </w:r>
+      <w:proofErr w:type="spellEnd"/>
       <w:r>
         <w:t xml:space="preserve"> test</w:t>
       </w:r>
@@ -5133,18 +5699,21 @@
         </w:rPr>
         <w:t xml:space="preserve">Apple smart device </w:t>
       </w:r>
+      <w:proofErr w:type="gramStart"/>
       <w:r>
         <w:rPr>
           <w:lang w:val="en-US"/>
         </w:rPr>
         <w:t>build</w:t>
       </w:r>
+      <w:proofErr w:type="gramEnd"/>
       <w:r>
         <w:rPr>
           <w:lang w:val="en-US"/>
         </w:rPr>
         <w:t xml:space="preserve"> </w:t>
       </w:r>
+      <w:proofErr w:type="spellStart"/>
       <w:r>
         <w:rPr>
           <w:lang w:val="en-US"/>
@@ -5157,42 +5726,49 @@
         </w:rPr>
         <w:t>uurt</w:t>
       </w:r>
+      <w:proofErr w:type="spellEnd"/>
       <w:r>
         <w:rPr>
           <w:lang w:val="en-US"/>
         </w:rPr>
         <w:t xml:space="preserve"> 4 </w:t>
       </w:r>
+      <w:proofErr w:type="spellStart"/>
       <w:r>
         <w:rPr>
           <w:lang w:val="en-US"/>
         </w:rPr>
         <w:t>minuten</w:t>
       </w:r>
+      <w:proofErr w:type="spellEnd"/>
       <w:r>
         <w:rPr>
           <w:lang w:val="en-US"/>
         </w:rPr>
         <w:t xml:space="preserve"> </w:t>
       </w:r>
+      <w:proofErr w:type="spellStart"/>
       <w:r>
         <w:rPr>
           <w:lang w:val="en-US"/>
         </w:rPr>
         <w:t>en</w:t>
       </w:r>
+      <w:proofErr w:type="spellEnd"/>
       <w:r>
         <w:rPr>
           <w:lang w:val="en-US"/>
         </w:rPr>
         <w:t xml:space="preserve"> 30 </w:t>
       </w:r>
+      <w:proofErr w:type="spellStart"/>
       <w:r>
         <w:rPr>
           <w:lang w:val="en-US"/>
         </w:rPr>
         <w:t>seconden</w:t>
       </w:r>
+      <w:proofErr w:type="spellEnd"/>
     </w:p>
     <w:p>
       <w:pPr>
@@ -5211,60 +5787,70 @@
         </w:rPr>
         <w:t xml:space="preserve">Apple </w:t>
       </w:r>
+      <w:proofErr w:type="gramStart"/>
       <w:r>
         <w:rPr>
           <w:lang w:val="en-US"/>
         </w:rPr>
         <w:t>simulator</w:t>
       </w:r>
+      <w:proofErr w:type="gramEnd"/>
       <w:r>
         <w:rPr>
           <w:lang w:val="en-US"/>
         </w:rPr>
         <w:t xml:space="preserve"> build </w:t>
       </w:r>
+      <w:proofErr w:type="spellStart"/>
       <w:r>
         <w:rPr>
           <w:lang w:val="en-US"/>
         </w:rPr>
         <w:t>duurt</w:t>
       </w:r>
+      <w:proofErr w:type="spellEnd"/>
       <w:r>
         <w:rPr>
           <w:lang w:val="en-US"/>
         </w:rPr>
         <w:t xml:space="preserve"> 7 </w:t>
       </w:r>
+      <w:proofErr w:type="spellStart"/>
       <w:r>
         <w:rPr>
           <w:lang w:val="en-US"/>
         </w:rPr>
         <w:t>minuten</w:t>
       </w:r>
+      <w:proofErr w:type="spellEnd"/>
       <w:r>
         <w:rPr>
           <w:lang w:val="en-US"/>
         </w:rPr>
         <w:t xml:space="preserve"> </w:t>
       </w:r>
+      <w:proofErr w:type="spellStart"/>
       <w:r>
         <w:rPr>
           <w:lang w:val="en-US"/>
         </w:rPr>
         <w:t>en</w:t>
       </w:r>
+      <w:proofErr w:type="spellEnd"/>
       <w:r>
         <w:rPr>
           <w:lang w:val="en-US"/>
         </w:rPr>
         <w:t xml:space="preserve"> 45 </w:t>
       </w:r>
+      <w:proofErr w:type="spellStart"/>
       <w:r>
         <w:rPr>
           <w:lang w:val="en-US"/>
         </w:rPr>
         <w:t>seconden</w:t>
       </w:r>
+      <w:proofErr w:type="spellEnd"/>
     </w:p>
     <w:p>
       <w:pPr>
@@ -5423,9 +6009,11 @@
       <w:r>
         <w:t xml:space="preserve">Zoals ambachtelijk werken terwijl er </w:t>
       </w:r>
+      <w:proofErr w:type="spellStart"/>
       <w:r>
         <w:t>tooling</w:t>
       </w:r>
+      <w:proofErr w:type="spellEnd"/>
       <w:r>
         <w:t xml:space="preserve"> voor bestaat</w:t>
       </w:r>
@@ -5485,9 +6073,11 @@
       <w:r>
         <w:t xml:space="preserve">Resources aantal met behulp van </w:t>
       </w:r>
+      <w:proofErr w:type="spellStart"/>
       <w:r>
         <w:t>TreeSize</w:t>
       </w:r>
+      <w:proofErr w:type="spellEnd"/>
     </w:p>
     <w:p>
       <w:pPr>
@@ -5522,7 +6112,19 @@
           <w:ilvl w:val="0"/>
           <w:numId w:val="24"/>
         </w:numPr>
-        <w:rPr/>
+        <w:rPr>
+          <w:ins w:author="Rinse Cramer" w:date="2025-11-04T23:03:00Z" w16du:dateUtc="2025-11-04T22:03:00Z" w:id="458"/>
+        </w:rPr>
+        <w:pPrChange w:author="Rinse Cramer" w:date="2025-11-04T23:03:00Z" w16du:dateUtc="2025-11-04T22:03:00Z" w:id="459">
+          <w:pPr>
+            <w:pStyle w:val="ListParagraph"/>
+            <w:numPr>
+              <w:ilvl w:val="1"/>
+              <w:numId w:val="24"/>
+            </w:numPr>
+            <w:ind w:left="1440" w:hanging="360"/>
+          </w:pPr>
+        </w:pPrChange>
       </w:pPr>
       <w:r>
         <w:t xml:space="preserve">1. </w:t>
@@ -5541,7 +6143,9 @@
           <w:ilvl w:val="0"/>
           <w:numId w:val="24"/>
         </w:numPr>
-        <w:rPr/>
+        <w:rPr>
+          <w:ins w:author="Rinse Cramer" w:date="2025-11-04T23:03:00Z" w16du:dateUtc="2025-11-04T22:03:00Z" w:id="460"/>
+        </w:rPr>
       </w:pPr>
       <w:r>
         <w:t>2. Heb ik een voorstel gedaan op het moment dat ik denk dat het, om welke reden dan ook, anders kan?</w:t>
@@ -5554,6 +6158,15 @@
           <w:ilvl w:val="1"/>
           <w:numId w:val="24"/>
         </w:numPr>
+        <w:pPrChange w:author="Rinse Cramer" w:date="2025-11-04T23:03:00Z" w16du:dateUtc="2025-11-04T22:03:00Z" w:id="462">
+          <w:pPr>
+            <w:pStyle w:val="ListParagraph"/>
+            <w:numPr>
+              <w:numId w:val="24"/>
+            </w:numPr>
+            <w:ind w:hanging="360"/>
+          </w:pPr>
+        </w:pPrChange>
       </w:pPr>
       <w:r>
         <w:t>Bij akkoord uitvoeren</w:t>
@@ -5676,12 +6289,14 @@
         </w:rPr>
         <w:t xml:space="preserve">G. </w:t>
       </w:r>
+      <w:proofErr w:type="spellStart"/>
       <w:r>
         <w:rPr>
           <w:rFonts w:ascii="Segoe UI Emoji" w:hAnsi="Segoe UI Emoji" w:cs="Segoe UI Emoji"/>
         </w:rPr>
         <w:t>Confidence</w:t>
       </w:r>
+      <w:proofErr w:type="spellEnd"/>
       <w:r>
         <w:rPr>
           <w:rFonts w:ascii="Segoe UI Emoji" w:hAnsi="Segoe UI Emoji" w:cs="Segoe UI Emoji"/>
@@ -5778,7 +6393,9 @@
           <w:ilvl w:val="0"/>
           <w:numId w:val="22"/>
         </w:numPr>
-        <w:rPr/>
+        <w:rPr>
+          <w:ins w:author="Rinse Cramer" w:date="2025-11-05T22:44:00Z" w16du:dateUtc="2025-11-05T21:44:00Z" w:id="464"/>
+        </w:rPr>
       </w:pPr>
       <w:r>
         <w:t xml:space="preserve">1. </w:t>
@@ -5809,7 +6426,9 @@
           <w:ilvl w:val="1"/>
           <w:numId w:val="22"/>
         </w:numPr>
-        <w:rPr/>
+        <w:rPr>
+          <w:ins w:author="Rinse Cramer" w:date="2025-11-05T22:46:00Z" w16du:dateUtc="2025-11-05T21:46:00Z" w:id="470"/>
+        </w:rPr>
       </w:pPr>
       <w:r>
         <w:t>Een n</w:t>
@@ -5831,11 +6450,15 @@
           <w:ilvl w:val="1"/>
           <w:numId w:val="22"/>
         </w:numPr>
-        <w:rPr/>
-      </w:pPr>
+        <w:rPr>
+          <w:ins w:author="Rinse Cramer" w:date="2025-11-05T22:45:00Z" w16du:dateUtc="2025-11-05T21:45:00Z" w:id="472"/>
+        </w:rPr>
+      </w:pPr>
+      <w:proofErr w:type="gramStart"/>
       <w:r>
         <w:t>Indien</w:t>
       </w:r>
+      <w:proofErr w:type="gramEnd"/>
       <w:r>
         <w:t xml:space="preserve"> meerdere iteraties: verschillen + en -</w:t>
       </w:r>
@@ -5862,7 +6485,9 @@
           <w:ilvl w:val="0"/>
           <w:numId w:val="22"/>
         </w:numPr>
-        <w:rPr/>
+        <w:rPr>
+          <w:del w:author="Rinse Cramer" w:date="2025-11-10T22:57:00Z" w16du:dateUtc="2025-11-10T21:57:00Z" w:id="476"/>
+        </w:rPr>
       </w:pPr>
     </w:p>
     <w:p>
@@ -5872,26 +6497,39 @@
           <w:ilvl w:val="1"/>
           <w:numId w:val="22"/>
         </w:numPr>
-        <w:rPr/>
+        <w:rPr>
+          <w:del w:author="Rinse Cramer" w:date="2025-11-10T22:57:00Z" w16du:dateUtc="2025-11-10T21:57:00Z" w:id="479"/>
+        </w:rPr>
       </w:pPr>
     </w:p>
     <w:p>
       <w:pPr>
         <w:pStyle w:val="Heading1"/>
         <w:rPr>
-          <w:rFonts w:ascii="Segoe UI Emoji" w:hAnsi="Segoe UI Emoji" w:cs="Segoe UI Emoji"/>
-        </w:rPr>
-      </w:pPr>
-    </w:p>
-    <w:p>
-      <w:pPr>
-        <w:pStyle w:val="ListParagraph"/>
+          <w:del w:author="Rinse Cramer" w:date="2025-11-03T23:40:00Z" w16du:dateUtc="2025-11-03T22:40:00Z" w:id="481"/>
+          <w:rFonts w:ascii="Segoe UI Emoji" w:hAnsi="Segoe UI Emoji" w:cs="Segoe UI Emoji"/>
+        </w:rPr>
+      </w:pPr>
+    </w:p>
+    <w:p>
+      <w:pPr>
+        <w:pStyle w:val="ListParagraph"/>
+        <w:pPrChange w:author="Rinse Cramer" w:date="2025-11-03T23:42:00Z" w16du:dateUtc="2025-11-03T22:42:00Z" w:id="483">
+          <w:pPr>
+            <w:pStyle w:val="ListParagraph"/>
+            <w:numPr>
+              <w:numId w:val="22"/>
+            </w:numPr>
+            <w:ind w:hanging="360"/>
+          </w:pPr>
+        </w:pPrChange>
       </w:pPr>
     </w:p>
     <w:p>
       <w:pPr>
         <w:pStyle w:val="Heading1"/>
         <w:rPr>
+          <w:del w:author="Rinse Cramer" w:date="2025-11-07T18:12:00Z" w16du:dateUtc="2025-11-07T17:12:00Z" w:id="485"/>
           <w:rFonts w:ascii="Segoe UI Emoji" w:hAnsi="Segoe UI Emoji" w:cs="Segoe UI Emoji"/>
         </w:rPr>
       </w:pPr>
@@ -5903,7 +6541,9 @@
           <w:ilvl w:val="0"/>
           <w:numId w:val="22"/>
         </w:numPr>
-        <w:rPr/>
+        <w:rPr>
+          <w:del w:author="Rinse Cramer" w:date="2025-11-07T18:12:00Z" w16du:dateUtc="2025-11-07T17:12:00Z" w:id="489"/>
+        </w:rPr>
       </w:pPr>
     </w:p>
     <w:p>
@@ -5913,7 +6553,9 @@
           <w:ilvl w:val="1"/>
           <w:numId w:val="22"/>
         </w:numPr>
-        <w:rPr/>
+        <w:rPr>
+          <w:del w:author="Rinse Cramer" w:date="2025-11-07T18:12:00Z" w16du:dateUtc="2025-11-07T17:12:00Z" w:id="491"/>
+        </w:rPr>
       </w:pPr>
     </w:p>
     <w:p>
@@ -6141,7 +6783,9 @@
           <w:ilvl w:val="0"/>
           <w:numId w:val="9"/>
         </w:numPr>
-        <w:rPr/>
+        <w:rPr>
+          <w:ins w:author="Rinse Cramer" w:date="2025-11-25T00:01:00Z" w16du:dateUtc="2025-11-24T23:01:00Z" w:id="499"/>
+        </w:rPr>
       </w:pPr>
       <w:r>
         <w:t xml:space="preserve">2. </w:t>
@@ -6153,7 +6797,9 @@
     <w:p>
       <w:pPr>
         <w:pStyle w:val="Heading2"/>
-        <w:rPr/>
+        <w:rPr>
+          <w:ins w:author="Rinse Cramer" w:date="2025-11-25T00:02:00Z" w16du:dateUtc="2025-11-24T23:02:00Z" w:id="500"/>
+        </w:rPr>
       </w:pPr>
       <w:r>
         <w:t xml:space="preserve">c. Heb ik </w:t>
@@ -6169,6 +6815,15 @@
           <w:ilvl w:val="0"/>
           <w:numId w:val="38"/>
         </w:numPr>
+        <w:pPrChange w:author="Rinse Cramer" w:date="2025-11-25T00:02:00Z" w16du:dateUtc="2025-11-24T23:02:00Z" w:id="502">
+          <w:pPr>
+            <w:pStyle w:val="ListParagraph"/>
+            <w:numPr>
+              <w:numId w:val="9"/>
+            </w:numPr>
+            <w:ind w:hanging="360"/>
+          </w:pPr>
+        </w:pPrChange>
       </w:pPr>
       <w:r>
         <w:t>1. Heb ik de grootste oorzaak kunnen vinden?</w:t>
@@ -6177,6 +6832,7 @@
     <w:p>
       <w:pPr>
         <w:rPr>
+          <w:del w:author="Rinse Cramer" w:date="2025-11-07T18:13:00Z" w16du:dateUtc="2025-11-07T17:13:00Z" w:id="504"/>
           <w:rFonts w:ascii="Segoe UI Emoji" w:hAnsi="Segoe UI Emoji" w:cs="Segoe UI Emoji" w:eastAsiaTheme="majorEastAsia"/>
           <w:color w:val="0F4761" w:themeColor="accent1" w:themeShade="BF"/>
           <w:sz w:val="40"/>
@@ -6187,13 +6843,30 @@
     <w:p>
       <w:pPr>
         <w:rPr>
-          <w:rFonts w:ascii="Segoe UI Emoji" w:hAnsi="Segoe UI Emoji" w:cs="Segoe UI Emoji"/>
-        </w:rPr>
-      </w:pPr>
-    </w:p>
-    <w:p>
-      <w:pPr>
-        <w:rPr/>
+          <w:del w:author="Rinse Cramer" w:date="2025-11-03T23:31:00Z" w16du:dateUtc="2025-11-03T22:31:00Z" w:id="506"/>
+          <w:rFonts w:ascii="Segoe UI Emoji" w:hAnsi="Segoe UI Emoji" w:cs="Segoe UI Emoji"/>
+        </w:rPr>
+        <w:pPrChange w:author="Rinse Cramer" w:date="2025-11-07T18:13:00Z" w16du:dateUtc="2025-11-07T17:13:00Z" w:id="507">
+          <w:pPr>
+            <w:pStyle w:val="Heading1"/>
+          </w:pPr>
+        </w:pPrChange>
+      </w:pPr>
+    </w:p>
+    <w:p>
+      <w:pPr>
+        <w:rPr>
+          <w:del w:author="Rinse Cramer" w:date="2025-11-03T23:31:00Z" w16du:dateUtc="2025-11-03T22:31:00Z" w:id="509"/>
+        </w:rPr>
+        <w:pPrChange w:author="Rinse Cramer" w:date="2025-11-07T18:14:00Z" w16du:dateUtc="2025-11-07T17:14:00Z" w:id="510">
+          <w:pPr>
+            <w:pStyle w:val="ListParagraph"/>
+            <w:numPr>
+              <w:numId w:val="8"/>
+            </w:numPr>
+            <w:ind w:hanging="360"/>
+          </w:pPr>
+        </w:pPrChange>
       </w:pPr>
     </w:p>
     <w:p>
@@ -6209,6 +6882,7 @@
     <w:p>
       <w:pPr>
         <w:rPr>
+          <w:ins w:author="Rinse Cramer" w:date="2025-11-25T00:05:00Z" w16du:dateUtc="2025-11-24T23:05:00Z" w:id="513"/>
           <w:rFonts w:ascii="Segoe UI Emoji" w:hAnsi="Segoe UI Emoji" w:cs="Segoe UI Emoji" w:eastAsiaTheme="majorEastAsia"/>
           <w:color w:val="0F4761" w:themeColor="accent1" w:themeShade="BF"/>
           <w:sz w:val="40"/>
@@ -6270,9 +6944,11 @@
       <w:r>
         <w:t xml:space="preserve">Verbeterpunt </w:t>
       </w:r>
+      <w:proofErr w:type="spellStart"/>
       <w:r>
         <w:t>opschrijving</w:t>
       </w:r>
+      <w:proofErr w:type="spellEnd"/>
       <w:r>
         <w:t xml:space="preserve"> in m</w:t>
       </w:r>
@@ -6325,7 +7001,9 @@
           <w:ilvl w:val="0"/>
           <w:numId w:val="8"/>
         </w:numPr>
-        <w:rPr/>
+        <w:rPr>
+          <w:ins w:author="Rinse Cramer" w:date="2025-11-21T09:27:00Z" w16du:dateUtc="2025-11-21T08:27:00Z" w:id="515"/>
+        </w:rPr>
       </w:pPr>
       <w:r>
         <w:t xml:space="preserve">1. </w:t>
@@ -6333,9 +7011,11 @@
       <w:r>
         <w:t xml:space="preserve">Verbeterpunt </w:t>
       </w:r>
+      <w:proofErr w:type="spellStart"/>
       <w:r>
         <w:t>opschrijving</w:t>
       </w:r>
+      <w:proofErr w:type="spellEnd"/>
       <w:r>
         <w:t xml:space="preserve"> in m</w:t>
       </w:r>
@@ -6353,14 +7033,18 @@
           <w:ilvl w:val="0"/>
           <w:numId w:val="8"/>
         </w:numPr>
-        <w:rPr/>
+        <w:rPr>
+          <w:del w:author="Rinse Cramer" w:date="2025-11-21T09:28:00Z" w16du:dateUtc="2025-11-21T08:28:00Z" w:id="516"/>
+        </w:rPr>
       </w:pPr>
       <w:r>
         <w:t xml:space="preserve">2. </w:t>
       </w:r>
+      <w:proofErr w:type="spellStart"/>
       <w:r>
         <w:t>Commit</w:t>
       </w:r>
+      <w:proofErr w:type="spellEnd"/>
       <w:r>
         <w:t xml:space="preserve"> en push werk naar Git-archief</w:t>
       </w:r>
@@ -6373,8 +7057,14 @@
           <w:numId w:val="8"/>
         </w:numPr>
         <w:rPr>
-          <w:rFonts w:ascii="Segoe UI Emoji" w:hAnsi="Segoe UI Emoji" w:cs="Segoe UI Emoji"/>
-        </w:rPr>
+          <w:del w:author="Rinse Cramer" w:date="2025-11-21T09:28:00Z" w16du:dateUtc="2025-11-21T08:28:00Z" w:id="518"/>
+          <w:rFonts w:ascii="Segoe UI Emoji" w:hAnsi="Segoe UI Emoji" w:cs="Segoe UI Emoji"/>
+        </w:rPr>
+        <w:pPrChange w:author="Rinse Cramer" w:date="2025-11-21T09:28:00Z" w16du:dateUtc="2025-11-21T08:28:00Z" w:id="519">
+          <w:pPr>
+            <w:pStyle w:val="Heading1"/>
+          </w:pPr>
+        </w:pPrChange>
       </w:pPr>
     </w:p>
     <w:p>

</xml_diff>